<commit_message>
Team-review build (--review): highlighted notes for Sam, Leroy and the team plus a checklist page; clean final rebuilt
Co-Authored-By: Claude Opus 5.5 <noreply@anthropic.com>
Claude-Session: https://claude.ai/code/session_01SZLM437PwZArBFHgvvPCk4
</commit_message>
<xml_diff>
--- a/01_Report/MTE4593 Group 9 SMR Report.docx
+++ b/01_Report/MTE4593 Group 9 SMR Report.docx
@@ -60848,6 +60848,14 @@
       <w:b w:val="0"/>
       <w:bCs w:val="0"/>
       <w:color w:themeColor="accent1" w:themeShade="BF" w:val="365F91"/>
+    </w:rPr>
+  </w:style>
+  <w:style w:customStyle="1" w:styleId="TeamNote" w:type="character">
+    <w:name w:val="Team Note"/>
+    <w:rPr>
+      <w:b/>
+      <w:color w:val="C00000"/>
+      <w:highlight w:val="yellow"/>
     </w:rPr>
   </w:style>
   <w:style w:type="paragraph" w:customStyle="1" w:styleId="SourceCode">

</xml_diff>

<commit_message>
WIP: merging Leroy's text into 8.2, 8.4, 8.5, 9 (writer running)
Co-Authored-By: Claude Opus 5.5 <noreply@anthropic.com>
Claude-Session: https://claude.ai/code/session_01SZLM437PwZArBFHgvvPCk4
</commit_message>
<xml_diff>
--- a/01_Report/MTE4593 Group 9 SMR Report.docx
+++ b/01_Report/MTE4593 Group 9 SMR Report.docx
@@ -2557,7 +2557,7 @@
         <w:t xml:space="preserve"> </w:t>
       </w:r>
       <w:r>
-        <w:t xml:space="preserve">Each unit uses 14,000 t (BWRX-300 Ostrołęka sp. z o.o., 2023). Blast-furnace steel emits about 2.33 t CO₂/t and scrap-based electric arc furnace (EAF) steel 0.68 (World Steel Association, 2026). Nuclear plate is not a drop-in, because copper from scrap embrittles vessel steel under irradiation and the CNSC finds the ASME copper limit of 0.2% too loose (Canadian Nuclear Safety Commission, 2023; US Nuclear Regulatory Commission, 1988).</w:t>
+        <w:t xml:space="preserve">Each unit uses 14,000 t (BWRX-300 Ostrołęka sp. z o.o., 2023). Blast-furnace steel emits about 2.33 t CO₂/t and scrap-based electric arc furnace (EAF) steel 0.68 (World Steel Association, 2026). Nuclear plate is not a drop-in, because copper from scrap embrittles vessel steel under irradiation and the CNSC finds the ASME copper limit of 0.2% too loose (Canadian Nuclear Safety Commission, 2023b; US Nuclear Regulatory Commission, 1988).</w:t>
       </w:r>
     </w:p>
     <w:p>
@@ -4685,7 +4685,7 @@
         <w:t xml:space="preserve"> </w:t>
       </w:r>
       <w:r>
-        <w:t xml:space="preserve">The licence to construct covers one unit, so Units 2–4 need a further CNSC authorisation, with C1 reviewed inside it (our inference). The cement standard already allows calcined-clay blends with up to 15% limestone (CSA Group, 2023; Hooton, 2023). The infill, though, is governed by GE-Hitachi’s topical report NEDO-33926 (self-consolidating concrete, strength per draft AISC N690, not CSA N287), which the CNSC and US NRC jointly reviewed (GE-Hitachi Nuclear Energy, 2024; US Nuclear Regulatory Commission and CNSC, 2025). To our reading the public report does not state a cement-type limit, and we found no nuclear precedent for calcined-clay infill: that is C1’s real licensing risk.</w:t>
+        <w:t xml:space="preserve">The construction licence (April 2025) covers one unit. The Canadian Nuclear Safety Commission (CNSC) reports that its first construction hold point was removed in March 2026, and OPG applied that month to operate Unit 1 (CNSC, 2026a; 2026b). Units 2–4 are not covered by the first licence, so they need a further authorisation, with C1 reviewed inside it. The review depends on safety class. Concrete in a non-safety auxiliary structure meets ordinary construction requirements, but infill in a safety-significant structure may alter the licensed design basis and needs a fuller demonstration. REGDOC-2.5.2 (version 2.1) sets risk-informed design requirements and classifies structures (CNSC, 2023a), so no containment standard should be applied to every structure. The cement standard already allows calcined-clay blends with up to 15% limestone (CSA Group, 2023; Hooton, 2023). The BWRX-300 containment is steel-plate composite, so the infill is governed by GE-Hitachi’s topical report NEDO-33926 (self-consolidating concrete, strength per draft AISC N690), which the CNSC and US NRC jointly reviewed (GE-Hitachi Nuclear Energy, 2024; US Nuclear Regulatory Commission and CNSC, 2025). CSA N287 applies only to concrete containment, where applicable (CSA Group, 2026). To our reading the public report does not state a cement-type limit, and we found no nuclear precedent for calcined-clay infill: that is C1’s real licensing risk. A lower carbon figure cannot override the acceptance criteria for strength, crack control or design life.</w:t>
       </w:r>
     </w:p>
     <w:p>
@@ -4703,7 +4703,7 @@
         <w:t xml:space="preserve"> </w:t>
       </w:r>
       <w:r>
-        <w:t xml:space="preserve">The non-safety pilot needs no nuclear qualification. Infill qualification must start in 2027, with slag (S1) as the fallback (§8.6).</w:t>
+        <w:t xml:space="preserve">The non-safety pilot needs no nuclear qualification. Infill qualification must start in 2027, with slag (S1) as the fallback (§8.6). At Liddell the barrier precedes any materials choice: none of these first-order barriers can be solved by changing Portland cement to LC³.</w:t>
       </w:r>
     </w:p>
     <w:p>
@@ -4915,7 +4915,7 @@
               <w:jc w:val="left"/>
             </w:pPr>
             <w:r>
-              <w:t xml:space="preserve">CNSC is established; Units 2–4 need a further authorisation (our inference)</w:t>
+              <w:t xml:space="preserve">CNSC is established; Units 2–4 need a further authorisation (CNSC, 2026a)</w:t>
             </w:r>
           </w:p>
         </w:tc>
@@ -5522,7 +5522,7 @@
         <w:t xml:space="preserve"> </w:t>
       </w:r>
       <w:r>
-        <w:t xml:space="preserve">C1 does not reduce fuel risk. Contracts with allied enrichers, as OPG uses, cut a buyer’s exposure but not concentration (§8.6). One Western option links back to Darlington: laser enrichment from Australia’s Silex Systems, commercialised in the US by Global Laser Enrichment (51% Silex, 49% Cameco, OPG’s uranium supplier). The NRC docketed its Paducah application in August 2025, as reported by Silex Systems Limited (2025), and Cameco has agreed to buy all its output (Silex Systems Limited, 2026, as reported by World Nuclear News, 2026). EPBC s 140A would bar such a plant in Australia (§10).</w:t>
+        <w:t xml:space="preserve">C1 does not reduce fuel risk. Fuel independence also needs conversion, enrichment, fabrication, forged components and skilled labour, not uranium deposits alone. Patents identify proprietary designs but do not establish any royalty per unit of electricity, so patent counts alone give no royalty estimate. The HHI measures nominal capacity, not the contracts open to one buyer. Contracts with allied enrichers, as OPG uses, cut a buyer’s exposure but not concentration (§8.6). C1 adds a small supply risk of its own. LC³ needs a suitable calcined-clay source and blending capacity (Scrivener et al., 2018), and a single qualified supplier would be a risk even if its product footprint were favourable. One Western option links back to Darlington: laser enrichment from Australia’s Silex Systems, commercialised in the US by Global Laser Enrichment (51% Silex, 49% Cameco, OPG’s uranium supplier). The NRC docketed its Paducah application in August 2025, as reported by Silex Systems Limited (2025), and Cameco has agreed to buy all its output (Silex Systems Limited, 2026, as reported by World Nuclear News, 2026). EPBC s 140A would bar such a plant in Australia (§10).</w:t>
       </w:r>
     </w:p>
     <w:p>
@@ -8455,7 +8455,7 @@
               <w:jc w:val="left"/>
             </w:pPr>
             <w:r>
-              <w:t xml:space="preserve">Scrap-EAF steel emits 0.68 against 2.33 t CO₂/t (World Steel Association, 2026), but copper limits scrap use in vessel steel (Canadian Nuclear Safety Commission, 2023)</w:t>
+              <w:t xml:space="preserve">Scrap-EAF steel emits 0.68 against 2.33 t CO₂/t (World Steel Association, 2026), but copper limits scrap use in vessel steel (Canadian Nuclear Safety Commission, 2023b)</w:t>
             </w:r>
           </w:p>
         </w:tc>
@@ -9296,7 +9296,7 @@
         <w:pStyle w:val="BodyText"/>
       </w:pPr>
       <w:r>
-        <w:t xml:space="preserve">Canadian Nuclear Safety Commission, 2023.</w:t>
+        <w:t xml:space="preserve">Canadian Nuclear Safety Commission, 2023a.</w:t>
       </w:r>
       <w:r>
         <w:t xml:space="preserve"> </w:t>
@@ -9306,10 +9306,10 @@
           <w:iCs/>
           <w:i/>
         </w:rPr>
-        <w:t xml:space="preserve">Regulatory consideration of environmental degradation in licensing light water small reactors in Canada</w:t>
-      </w:r>
-      <w:r>
-        <w:t xml:space="preserve">. [online] Technical paper. Ottawa: Canadian Nuclear Safety Commission. Available at: https://cnsc-ccsn.gc.ca/eng/resources/research/technical-papers-and-articles/2023/regulatory-consideration-of-environmental-degradation-in-licensing-light-water-small-reactor-in-canada [Accessed 25 October 2026].</w:t>
+        <w:t xml:space="preserve">REGDOC-2.5.2, Design of Reactor Facilities: Nuclear Power Plants</w:t>
+      </w:r>
+      <w:r>
+        <w:t xml:space="preserve">, Version 2.1. [online] Ottawa: Canadian Nuclear Safety Commission. Available at: https://www.cnsc-ccsn.gc.ca/eng/acts-and-regulations/regulatory-documents/published/html/regdoc2-5-2-v2-1/ [Accessed 25 October 2026].</w:t>
       </w:r>
     </w:p>
     <w:p>
@@ -9317,7 +9317,7 @@
         <w:pStyle w:val="BodyText"/>
       </w:pPr>
       <w:r>
-        <w:t xml:space="preserve">Canadian Nuclear Safety Commission, 2024.</w:t>
+        <w:t xml:space="preserve">Canadian Nuclear Safety Commission, 2023b.</w:t>
       </w:r>
       <w:r>
         <w:t xml:space="preserve"> </w:t>
@@ -9327,13 +9327,10 @@
           <w:iCs/>
           <w:i/>
         </w:rPr>
-        <w:t xml:space="preserve">CMD 24-H3-1B</w:t>
-      </w:r>
-      <w:r>
-        <w:t xml:space="preserve"> </w:t>
-      </w:r>
-      <w:r>
-        <w:t xml:space="preserve">(staff presentation, Darlington New Nuclear Project). [pdf] Ottawa: Canadian Nuclear Safety Commission. Available at: https://api.cnsc-ccsn.gc.ca/dms/digital-medias/CMD-24-H3-1B.pdf/object.</w:t>
+        <w:t xml:space="preserve">Regulatory consideration of environmental degradation in licensing light water small reactors in Canada</w:t>
+      </w:r>
+      <w:r>
+        <w:t xml:space="preserve">. [online] Technical paper. Ottawa: Canadian Nuclear Safety Commission. Available at: https://cnsc-ccsn.gc.ca/eng/resources/research/technical-papers-and-articles/2023/regulatory-consideration-of-environmental-degradation-in-licensing-light-water-small-reactor-in-canada [Accessed 25 October 2026].</w:t>
       </w:r>
     </w:p>
     <w:p>
@@ -9341,7 +9338,7 @@
         <w:pStyle w:val="BodyText"/>
       </w:pPr>
       <w:r>
-        <w:t xml:space="preserve">Canadian Nuclear Safety Commission, 2025.</w:t>
+        <w:t xml:space="preserve">Canadian Nuclear Safety Commission, 2024.</w:t>
       </w:r>
       <w:r>
         <w:t xml:space="preserve"> </w:t>
@@ -9351,10 +9348,13 @@
           <w:iCs/>
           <w:i/>
         </w:rPr>
-        <w:t xml:space="preserve">Commission authorizes Ontario Power Generation Inc. to construct 1 BWRX-300 reactor at the Darlington New Nuclear Project site</w:t>
-      </w:r>
-      <w:r>
-        <w:t xml:space="preserve">. [online] News release, 4 April. Ottawa: Canadian Nuclear Safety Commission. Available at: https://www.canada.ca/en/nuclear-safety-commission/news/2025/04/commission-authorizes-ontario-power-generation-inc-to-construct-1-bwrx-300-reactor-at-the-darlington-new-nuclear-project-site.html [Accessed 20 October 2026].</w:t>
+        <w:t xml:space="preserve">CMD 24-H3-1B</w:t>
+      </w:r>
+      <w:r>
+        <w:t xml:space="preserve"> </w:t>
+      </w:r>
+      <w:r>
+        <w:t xml:space="preserve">(staff presentation, Darlington New Nuclear Project). [pdf] Ottawa: Canadian Nuclear Safety Commission. Available at: https://api.cnsc-ccsn.gc.ca/dms/digital-medias/CMD-24-H3-1B.pdf/object.</w:t>
       </w:r>
     </w:p>
     <w:p>
@@ -9362,7 +9362,7 @@
         <w:pStyle w:val="BodyText"/>
       </w:pPr>
       <w:r>
-        <w:t xml:space="preserve">Canadian Nuclear Safety Commission, 2026a.</w:t>
+        <w:t xml:space="preserve">Canadian Nuclear Safety Commission, 2025.</w:t>
       </w:r>
       <w:r>
         <w:t xml:space="preserve"> </w:t>
@@ -9372,10 +9372,10 @@
           <w:iCs/>
           <w:i/>
         </w:rPr>
-        <w:t xml:space="preserve">Darlington New Nuclear Project</w:t>
-      </w:r>
-      <w:r>
-        <w:t xml:space="preserve">. [online] Ottawa: Canadian Nuclear Safety Commission. Available at: https://www.cnsc-ccsn.gc.ca/eng/reactors/new-reactor-power-plant-projects/new-reactor-power-plant-facilities/darlington-new-nuclear-project/ [Accessed 20 October 2026].</w:t>
+        <w:t xml:space="preserve">Commission authorizes Ontario Power Generation Inc. to construct 1 BWRX-300 reactor at the Darlington New Nuclear Project site</w:t>
+      </w:r>
+      <w:r>
+        <w:t xml:space="preserve">. [online] News release, 4 April. Ottawa: Canadian Nuclear Safety Commission. Available at: https://www.canada.ca/en/nuclear-safety-commission/news/2025/04/commission-authorizes-ontario-power-generation-inc-to-construct-1-bwrx-300-reactor-at-the-darlington-new-nuclear-project-site.html [Accessed 20 October 2026].</w:t>
       </w:r>
     </w:p>
     <w:p>
@@ -9383,7 +9383,7 @@
         <w:pStyle w:val="BodyText"/>
       </w:pPr>
       <w:r>
-        <w:t xml:space="preserve">Canadian Nuclear Safety Commission, 2026b.</w:t>
+        <w:t xml:space="preserve">Canadian Nuclear Safety Commission, 2026a.</w:t>
       </w:r>
       <w:r>
         <w:t xml:space="preserve"> </w:t>
@@ -9393,10 +9393,10 @@
           <w:iCs/>
           <w:i/>
         </w:rPr>
-        <w:t xml:space="preserve">Regulatory hold points for new reactor facilities</w:t>
-      </w:r>
-      <w:r>
-        <w:t xml:space="preserve">. [online] Available at: https://www.cnsc-ccsn.gc.ca/eng/reactors/regulatory-hold-points/new-reactors/ [Accessed 20 October 2026].</w:t>
+        <w:t xml:space="preserve">Darlington New Nuclear Project</w:t>
+      </w:r>
+      <w:r>
+        <w:t xml:space="preserve">. [online] Ottawa: Canadian Nuclear Safety Commission. Available at: https://www.cnsc-ccsn.gc.ca/eng/reactors/new-reactor-power-plant-projects/new-reactor-power-plant-facilities/darlington-new-nuclear-project/ [Accessed 20 October 2026].</w:t>
       </w:r>
     </w:p>
     <w:p>
@@ -9404,7 +9404,7 @@
         <w:pStyle w:val="BodyText"/>
       </w:pPr>
       <w:r>
-        <w:t xml:space="preserve">Canadian Ready-Mixed Concrete Association, 2022.</w:t>
+        <w:t xml:space="preserve">Canadian Nuclear Safety Commission, 2026b.</w:t>
       </w:r>
       <w:r>
         <w:t xml:space="preserve"> </w:t>
@@ -9414,13 +9414,10 @@
           <w:iCs/>
           <w:i/>
         </w:rPr>
-        <w:t xml:space="preserve">Industry-wide EPD for ready-mixed concrete, Ontario</w:t>
-      </w:r>
-      <w:r>
-        <w:t xml:space="preserve"> </w:t>
-      </w:r>
-      <w:r>
-        <w:t xml:space="preserve">(EPD 351, valid to 27 July 2027). [pdf] Available at: https://www.rmcao.org/wp-content/uploads/2023/04/CRMCA-EPD-Ontario-20220803.pdf.</w:t>
+        <w:t xml:space="preserve">Regulatory hold points for new reactor facilities</w:t>
+      </w:r>
+      <w:r>
+        <w:t xml:space="preserve">. [online] Available at: https://www.cnsc-ccsn.gc.ca/eng/reactors/regulatory-hold-points/new-reactors/ [Accessed 20 October 2026].</w:t>
       </w:r>
     </w:p>
     <w:p>
@@ -9428,7 +9425,7 @@
         <w:pStyle w:val="BodyText"/>
       </w:pPr>
       <w:r>
-        <w:t xml:space="preserve">Canberra Times, 2025. Dutton’s nuclear power plan faces legal hurdles.</w:t>
+        <w:t xml:space="preserve">Canadian Ready-Mixed Concrete Association, 2022.</w:t>
       </w:r>
       <w:r>
         <w:t xml:space="preserve"> </w:t>
@@ -9438,10 +9435,13 @@
           <w:iCs/>
           <w:i/>
         </w:rPr>
-        <w:t xml:space="preserve">Canberra Times</w:t>
-      </w:r>
-      <w:r>
-        <w:t xml:space="preserve">. [online] Available at: https://www.canberratimes.com.au/story/8851241/duttons-nuclear-power-plan-faces-legal-hurdles/ [Accessed 20 October 2026].</w:t>
+        <w:t xml:space="preserve">Industry-wide EPD for ready-mixed concrete, Ontario</w:t>
+      </w:r>
+      <w:r>
+        <w:t xml:space="preserve"> </w:t>
+      </w:r>
+      <w:r>
+        <w:t xml:space="preserve">(EPD 351, valid to 27 July 2027). [pdf] Available at: https://www.rmcao.org/wp-content/uploads/2023/04/CRMCA-EPD-Ontario-20220803.pdf.</w:t>
       </w:r>
     </w:p>
     <w:p>
@@ -9449,22 +9449,7 @@
         <w:pStyle w:val="BodyText"/>
       </w:pPr>
       <w:r>
-        <w:t xml:space="preserve">Canberra Times, n.d.</w:t>
-      </w:r>
-      <w:r>
-        <w:t xml:space="preserve"> </w:t>
-      </w:r>
-      <w:r>
-        <w:t xml:space="preserve">‘</w:t>
-      </w:r>
-      <w:r>
-        <w:t xml:space="preserve">Nightmare scenario</w:t>
-      </w:r>
-      <w:r>
-        <w:t xml:space="preserve">’</w:t>
-      </w:r>
-      <w:r>
-        <w:t xml:space="preserve">: states slam Dutton’s nuclear plan.</w:t>
+        <w:t xml:space="preserve">Canberra Times, 2025. Dutton’s nuclear power plan faces legal hurdles.</w:t>
       </w:r>
       <w:r>
         <w:t xml:space="preserve"> </w:t>
@@ -9477,7 +9462,7 @@
         <w:t xml:space="preserve">Canberra Times</w:t>
       </w:r>
       <w:r>
-        <w:t xml:space="preserve">. [online] Available at: https://www.canberratimes.com.au/story/8668232/nightmare-scenario-states-slam-duttons-nuclear-plan/ [Accessed 20 October 2026].</w:t>
+        <w:t xml:space="preserve">. [online] Available at: https://www.canberratimes.com.au/story/8851241/duttons-nuclear-power-plan-faces-legal-hurdles/ [Accessed 20 October 2026].</w:t>
       </w:r>
     </w:p>
     <w:p>
@@ -9485,7 +9470,22 @@
         <w:pStyle w:val="BodyText"/>
       </w:pPr>
       <w:r>
-        <w:t xml:space="preserve">Carless, T.S., Griffin, W.M. and Fischbeck, P.S., 2016. The environmental competitiveness of small modular reactors: a life cycle study.</w:t>
+        <w:t xml:space="preserve">Canberra Times, n.d.</w:t>
+      </w:r>
+      <w:r>
+        <w:t xml:space="preserve"> </w:t>
+      </w:r>
+      <w:r>
+        <w:t xml:space="preserve">‘</w:t>
+      </w:r>
+      <w:r>
+        <w:t xml:space="preserve">Nightmare scenario</w:t>
+      </w:r>
+      <w:r>
+        <w:t xml:space="preserve">’</w:t>
+      </w:r>
+      <w:r>
+        <w:t xml:space="preserve">: states slam Dutton’s nuclear plan.</w:t>
       </w:r>
       <w:r>
         <w:t xml:space="preserve"> </w:t>
@@ -9495,10 +9495,10 @@
           <w:iCs/>
           <w:i/>
         </w:rPr>
-        <w:t xml:space="preserve">Energy</w:t>
-      </w:r>
-      <w:r>
-        <w:t xml:space="preserve">, 114, pp.84–99. Available at: https://ideas.repec.org/a/eee/energy/v114y2016icp84-99.html.</w:t>
+        <w:t xml:space="preserve">Canberra Times</w:t>
+      </w:r>
+      <w:r>
+        <w:t xml:space="preserve">. [online] Available at: https://www.canberratimes.com.au/story/8668232/nightmare-scenario-states-slam-duttons-nuclear-plan/ [Accessed 20 October 2026].</w:t>
       </w:r>
     </w:p>
     <w:p>
@@ -9506,7 +9506,7 @@
         <w:pStyle w:val="BodyText"/>
       </w:pPr>
       <w:r>
-        <w:t xml:space="preserve">Cement Association of Canada, 2022.</w:t>
+        <w:t xml:space="preserve">Carless, T.S., Griffin, W.M. and Fischbeck, P.S., 2016. The environmental competitiveness of small modular reactors: a life cycle study.</w:t>
       </w:r>
       <w:r>
         <w:t xml:space="preserve"> </w:t>
@@ -9516,41 +9516,41 @@
           <w:iCs/>
           <w:i/>
         </w:rPr>
-        <w:t xml:space="preserve">Environmental Product Declaration: General Use (GU) and Portland-Limestone (GUL) Cements</w:t>
-      </w:r>
-      <w:r>
-        <w:t xml:space="preserve">. [pdf] Available at: https://www.astm.org/v3/assets/blt5eb0a2cb04534832/blt9992df315e96e31c/697b1f51f6a61062618f5048/919.CAC_General_Use_(GU)</w:t>
+        <w:t xml:space="preserve">Energy</w:t>
+      </w:r>
+      <w:r>
+        <w:t xml:space="preserve">, 114, pp.84–99. Available at: https://ideas.repec.org/a/eee/energy/v114y2016icp84-99.html.</w:t>
+      </w:r>
+    </w:p>
+    <w:p>
+      <w:pPr>
+        <w:pStyle w:val="BodyText"/>
+      </w:pPr>
+      <w:r>
+        <w:t xml:space="preserve">Cement Association of Canada, 2022.</w:t>
+      </w:r>
+      <w:r>
+        <w:t xml:space="preserve"> </w:t>
       </w:r>
       <w:r>
         <w:rPr>
           <w:iCs/>
           <w:i/>
         </w:rPr>
-        <w:t xml:space="preserve">and_Portland-Limestone</w:t>
-      </w:r>
-      <w:r>
-        <w:t xml:space="preserve">(GUL)_Cements.pdf.</w:t>
-      </w:r>
-    </w:p>
-    <w:p>
-      <w:pPr>
-        <w:pStyle w:val="BodyText"/>
-      </w:pPr>
-      <w:r>
-        <w:t xml:space="preserve">Circular Ecology, 2019.</w:t>
-      </w:r>
-      <w:r>
-        <w:t xml:space="preserve"> </w:t>
+        <w:t xml:space="preserve">Environmental Product Declaration: General Use (GU) and Portland-Limestone (GUL) Cements</w:t>
+      </w:r>
+      <w:r>
+        <w:t xml:space="preserve">. [pdf] Available at: https://www.astm.org/v3/assets/blt5eb0a2cb04534832/blt9992df315e96e31c/697b1f51f6a61062618f5048/919.CAC_General_Use_(GU)</w:t>
       </w:r>
       <w:r>
         <w:rPr>
           <w:iCs/>
           <w:i/>
         </w:rPr>
-        <w:t xml:space="preserve">Inventory of Carbon and Energy (ICE) database v3.0</w:t>
-      </w:r>
-      <w:r>
-        <w:t xml:space="preserve">. Bath: Circular Ecology.</w:t>
+        <w:t xml:space="preserve">and_Portland-Limestone</w:t>
+      </w:r>
+      <w:r>
+        <w:t xml:space="preserve">(GUL)_Cements.pdf.</w:t>
       </w:r>
     </w:p>
     <w:p>
@@ -9558,7 +9558,7 @@
         <w:pStyle w:val="BodyText"/>
       </w:pPr>
       <w:r>
-        <w:t xml:space="preserve">Concrete Reinforcing Steel Institute, 2017.</w:t>
+        <w:t xml:space="preserve">Circular Ecology, 2019.</w:t>
       </w:r>
       <w:r>
         <w:t xml:space="preserve"> </w:t>
@@ -9568,10 +9568,10 @@
           <w:iCs/>
           <w:i/>
         </w:rPr>
-        <w:t xml:space="preserve">Industry-wide EPD for fabricated steel reinforcing bar</w:t>
-      </w:r>
-      <w:r>
-        <w:t xml:space="preserve">. [pdf] Available at: https://www.astm.org/v3/assets/blt5eb0a2cb04534832/blt4900ac0ff22764a2/697b1fc25e3544dd57d83a3d/362.EPD_for_CRSI_EPD_FINAL_2017-08-28.pdf.</w:t>
+        <w:t xml:space="preserve">Inventory of Carbon and Energy (ICE) database v3.0</w:t>
+      </w:r>
+      <w:r>
+        <w:t xml:space="preserve">. Bath: Circular Ecology.</w:t>
       </w:r>
     </w:p>
     <w:p>
@@ -9579,7 +9579,7 @@
         <w:pStyle w:val="BodyText"/>
       </w:pPr>
       <w:r>
-        <w:t xml:space="preserve">Concrete Reinforcing Steel Institute, 2022.</w:t>
+        <w:t xml:space="preserve">Concrete Reinforcing Steel Institute, 2017.</w:t>
       </w:r>
       <w:r>
         <w:t xml:space="preserve"> </w:t>
@@ -9589,10 +9589,10 @@
           <w:iCs/>
           <w:i/>
         </w:rPr>
-        <w:t xml:space="preserve">Environmental Product Declaration: Fabricated Steel Reinforcement</w:t>
-      </w:r>
-      <w:r>
-        <w:t xml:space="preserve">. Schaumburg, IL: Concrete Reinforcing Steel Institute. Available at: https://www.crsi.org/sustainability/environmental-product-declaration/.</w:t>
+        <w:t xml:space="preserve">Industry-wide EPD for fabricated steel reinforcing bar</w:t>
+      </w:r>
+      <w:r>
+        <w:t xml:space="preserve">. [pdf] Available at: https://www.astm.org/v3/assets/blt5eb0a2cb04534832/blt4900ac0ff22764a2/697b1fc25e3544dd57d83a3d/362.EPD_for_CRSI_EPD_FINAL_2017-08-28.pdf.</w:t>
       </w:r>
     </w:p>
     <w:p>
@@ -9600,7 +9600,7 @@
         <w:pStyle w:val="BodyText"/>
       </w:pPr>
       <w:r>
-        <w:t xml:space="preserve">Conference Board of Canada, 2021.</w:t>
+        <w:t xml:space="preserve">Concrete Reinforcing Steel Institute, 2022.</w:t>
       </w:r>
       <w:r>
         <w:t xml:space="preserve"> </w:t>
@@ -9610,10 +9610,10 @@
           <w:iCs/>
           <w:i/>
         </w:rPr>
-        <w:t xml:space="preserve">A New Power: The Economic Impacts of Small Modular Reactors</w:t>
-      </w:r>
-      <w:r>
-        <w:t xml:space="preserve">. Ottawa: Conference Board of Canada.</w:t>
+        <w:t xml:space="preserve">Environmental Product Declaration: Fabricated Steel Reinforcement</w:t>
+      </w:r>
+      <w:r>
+        <w:t xml:space="preserve">. Schaumburg, IL: Concrete Reinforcing Steel Institute. Available at: https://www.crsi.org/sustainability/environmental-product-declaration/.</w:t>
       </w:r>
     </w:p>
     <w:p>
@@ -9621,7 +9621,7 @@
         <w:pStyle w:val="BodyText"/>
       </w:pPr>
       <w:r>
-        <w:t xml:space="preserve">CSA Group, 2023.</w:t>
+        <w:t xml:space="preserve">Conference Board of Canada, 2021.</w:t>
       </w:r>
       <w:r>
         <w:t xml:space="preserve"> </w:t>
@@ -9631,13 +9631,18 @@
           <w:iCs/>
           <w:i/>
         </w:rPr>
-        <w:t xml:space="preserve">CSA A3000:23, Cementitious materials compendium</w:t>
-      </w:r>
-      <w:r>
-        <w:t xml:space="preserve"> </w:t>
-      </w:r>
-      <w:r>
-        <w:t xml:space="preserve">(includes CSA A3001:23,</w:t>
+        <w:t xml:space="preserve">A New Power: The Economic Impacts of Small Modular Reactors</w:t>
+      </w:r>
+      <w:r>
+        <w:t xml:space="preserve">. Ottawa: Conference Board of Canada.</w:t>
+      </w:r>
+    </w:p>
+    <w:p>
+      <w:pPr>
+        <w:pStyle w:val="BodyText"/>
+      </w:pPr>
+      <w:r>
+        <w:t xml:space="preserve">CSA Group, 2023.</w:t>
       </w:r>
       <w:r>
         <w:t xml:space="preserve"> </w:t>
@@ -9647,18 +9652,13 @@
           <w:iCs/>
           <w:i/>
         </w:rPr>
-        <w:t xml:space="preserve">Cementitious materials for use in concrete</w:t>
-      </w:r>
-      <w:r>
-        <w:t xml:space="preserve">). [online] Toronto: CSA Group. Available at: https://www.csagroup.org/store/product/2430659/ [Accessed 20 October 2026].</w:t>
-      </w:r>
-    </w:p>
-    <w:p>
-      <w:pPr>
-        <w:pStyle w:val="BodyText"/>
-      </w:pPr>
-      <w:r>
-        <w:t xml:space="preserve">Curve Lake First Nation, 2024.</w:t>
+        <w:t xml:space="preserve">CSA A3000:23, Cementitious materials compendium</w:t>
+      </w:r>
+      <w:r>
+        <w:t xml:space="preserve"> </w:t>
+      </w:r>
+      <w:r>
+        <w:t xml:space="preserve">(includes CSA A3001:23,</w:t>
       </w:r>
       <w:r>
         <w:t xml:space="preserve"> </w:t>
@@ -9668,10 +9668,10 @@
           <w:iCs/>
           <w:i/>
         </w:rPr>
-        <w:t xml:space="preserve">Written submission, CMD 24-H3.83, DNNP licence to construct</w:t>
-      </w:r>
-      <w:r>
-        <w:t xml:space="preserve">, 11 November. Available at: https://api.cnsc-ccsn.gc.ca/dms/digital-medias/CMD24-H3-83.pdf/object [Accessed 21 October 2026].</w:t>
+        <w:t xml:space="preserve">Cementitious materials for use in concrete</w:t>
+      </w:r>
+      <w:r>
+        <w:t xml:space="preserve">). [online] Toronto: CSA Group. Available at: https://www.csagroup.org/store/product/2430659/ [Accessed 20 October 2026].</w:t>
       </w:r>
     </w:p>
     <w:p>
@@ -9679,7 +9679,7 @@
         <w:pStyle w:val="BodyText"/>
       </w:pPr>
       <w:r>
-        <w:t xml:space="preserve">Department of Climate Change, Energy, the Environment and Water, 2025.</w:t>
+        <w:t xml:space="preserve">CSA Group, 2026.</w:t>
       </w:r>
       <w:r>
         <w:t xml:space="preserve"> </w:t>
@@ -9689,10 +9689,10 @@
           <w:iCs/>
           <w:i/>
         </w:rPr>
-        <w:t xml:space="preserve">Australian National Greenhouse Accounts Factors: 2025</w:t>
-      </w:r>
-      <w:r>
-        <w:t xml:space="preserve">. [pdf/xlsx] Canberra: Department of Climate Change, Energy, the Environment and Water.</w:t>
+        <w:t xml:space="preserve">CSA N287.2, Material requirements for concrete containment structures for nuclear power plants</w:t>
+      </w:r>
+      <w:r>
+        <w:t xml:space="preserve">. [online] Standard catalogue information. Toronto: CSA Group. Available at: https://webstore.ansi.org/standards/csa/csan2872026 [Accessed 25 October 2026].</w:t>
       </w:r>
     </w:p>
     <w:p>
@@ -9700,7 +9700,7 @@
         <w:pStyle w:val="BodyText"/>
       </w:pPr>
       <w:r>
-        <w:t xml:space="preserve">Department of Industry, Science, Energy and Resources, 2020.</w:t>
+        <w:t xml:space="preserve">Curve Lake First Nation, 2024.</w:t>
       </w:r>
       <w:r>
         <w:t xml:space="preserve"> </w:t>
@@ -9710,10 +9710,10 @@
           <w:iCs/>
           <w:i/>
         </w:rPr>
-        <w:t xml:space="preserve">A new agency to manage radioactive waste</w:t>
-      </w:r>
-      <w:r>
-        <w:t xml:space="preserve">. [online] Available at: https://industry.gov.au/news-media/australian-radioactive-waste-agency-news/a-new-agency-to-manage-radioactive-waste [Accessed 21 October 2026].</w:t>
+        <w:t xml:space="preserve">Written submission, CMD 24-H3.83, DNNP licence to construct</w:t>
+      </w:r>
+      <w:r>
+        <w:t xml:space="preserve">, 11 November. Available at: https://api.cnsc-ccsn.gc.ca/dms/digital-medias/CMD24-H3-83.pdf/object [Accessed 21 October 2026].</w:t>
       </w:r>
     </w:p>
     <w:p>
@@ -9721,7 +9721,7 @@
         <w:pStyle w:val="BodyText"/>
       </w:pPr>
       <w:r>
-        <w:t xml:space="preserve">Development Alternatives, n.d.</w:t>
+        <w:t xml:space="preserve">Department of Climate Change, Energy, the Environment and Water, 2025.</w:t>
       </w:r>
       <w:r>
         <w:t xml:space="preserve"> </w:t>
@@ -9731,13 +9731,10 @@
           <w:iCs/>
           <w:i/>
         </w:rPr>
-        <w:t xml:space="preserve">LC3 Sustainability Assessment</w:t>
-      </w:r>
-      <w:r>
-        <w:t xml:space="preserve"> </w:t>
-      </w:r>
-      <w:r>
-        <w:t xml:space="preserve">(ver 1.14). Available at: https://devalt.org/images/L2_ProjectPdfs/Report%20-%20LC3%20Sustainability%20Assessment_ver1.14.pdf.</w:t>
+        <w:t xml:space="preserve">Australian National Greenhouse Accounts Factors: 2025</w:t>
+      </w:r>
+      <w:r>
+        <w:t xml:space="preserve">. [pdf/xlsx] Canberra: Department of Climate Change, Energy, the Environment and Water.</w:t>
       </w:r>
     </w:p>
     <w:p>
@@ -9745,7 +9742,7 @@
         <w:pStyle w:val="BodyText"/>
       </w:pPr>
       <w:r>
-        <w:t xml:space="preserve">Dodgson, J.S., Spackman, M., Pearman, A. and Phillips, L.D., 2009.</w:t>
+        <w:t xml:space="preserve">Department of Industry, Science, Energy and Resources, 2020.</w:t>
       </w:r>
       <w:r>
         <w:t xml:space="preserve"> </w:t>
@@ -9755,10 +9752,10 @@
           <w:iCs/>
           <w:i/>
         </w:rPr>
-        <w:t xml:space="preserve">Multi-criteria analysis: a manual</w:t>
-      </w:r>
-      <w:r>
-        <w:t xml:space="preserve">. London: Department for Communities and Local Government. Available at: https://www.gov.uk/government/publications/multi-criteria-analysis-manual-for-making-government-policy [Accessed 21 October 2026].</w:t>
+        <w:t xml:space="preserve">A new agency to manage radioactive waste</w:t>
+      </w:r>
+      <w:r>
+        <w:t xml:space="preserve">. [online] Available at: https://industry.gov.au/news-media/australian-radioactive-waste-agency-news/a-new-agency-to-manage-radioactive-waste [Accessed 21 October 2026].</w:t>
       </w:r>
     </w:p>
     <w:p>
@@ -9766,7 +9763,7 @@
         <w:pStyle w:val="BodyText"/>
       </w:pPr>
       <w:r>
-        <w:t xml:space="preserve">EDF R&amp;D, 2024. Life cycle assessment of nuclear power in France: EDF case study.</w:t>
+        <w:t xml:space="preserve">Development Alternatives, n.d.</w:t>
       </w:r>
       <w:r>
         <w:t xml:space="preserve"> </w:t>
@@ -9776,10 +9773,13 @@
           <w:iCs/>
           <w:i/>
         </w:rPr>
-        <w:t xml:space="preserve">EPJ Nuclear Sciences &amp; Technologies</w:t>
-      </w:r>
-      <w:r>
-        <w:t xml:space="preserve">, 10, art. 5. Available at: https://www.epj-n.org/10.1051/epjn/2024005.</w:t>
+        <w:t xml:space="preserve">LC3 Sustainability Assessment</w:t>
+      </w:r>
+      <w:r>
+        <w:t xml:space="preserve"> </w:t>
+      </w:r>
+      <w:r>
+        <w:t xml:space="preserve">(ver 1.14). Available at: https://devalt.org/images/L2_ProjectPdfs/Report%20-%20LC3%20Sustainability%20Assessment_ver1.14.pdf.</w:t>
       </w:r>
     </w:p>
     <w:p>
@@ -9787,7 +9787,7 @@
         <w:pStyle w:val="BodyText"/>
       </w:pPr>
       <w:r>
-        <w:t xml:space="preserve">EFNARC, 2005.</w:t>
+        <w:t xml:space="preserve">Dodgson, J.S., Spackman, M., Pearman, A. and Phillips, L.D., 2009.</w:t>
       </w:r>
       <w:r>
         <w:t xml:space="preserve"> </w:t>
@@ -9797,10 +9797,10 @@
           <w:iCs/>
           <w:i/>
         </w:rPr>
-        <w:t xml:space="preserve">The European Guidelines for Self-Compacting Concrete: Specification, Production and Use</w:t>
-      </w:r>
-      <w:r>
-        <w:t xml:space="preserve">. Farnham: EFNARC.</w:t>
+        <w:t xml:space="preserve">Multi-criteria analysis: a manual</w:t>
+      </w:r>
+      <w:r>
+        <w:t xml:space="preserve">. London: Department for Communities and Local Government. Available at: https://www.gov.uk/government/publications/multi-criteria-analysis-manual-for-making-government-policy [Accessed 21 October 2026].</w:t>
       </w:r>
     </w:p>
     <w:p>
@@ -9808,7 +9808,7 @@
         <w:pStyle w:val="BodyText"/>
       </w:pPr>
       <w:r>
-        <w:t xml:space="preserve">ENR, 2018. Clay and limestone cement could cut carbon emissions.</w:t>
+        <w:t xml:space="preserve">EDF R&amp;D, 2024. Life cycle assessment of nuclear power in France: EDF case study.</w:t>
       </w:r>
       <w:r>
         <w:t xml:space="preserve"> </w:t>
@@ -9818,10 +9818,10 @@
           <w:iCs/>
           <w:i/>
         </w:rPr>
-        <w:t xml:space="preserve">Engineering News-Record</w:t>
-      </w:r>
-      <w:r>
-        <w:t xml:space="preserve">, 7 May. Available at: https://digital.bnpmedia.com/article/Construction+Materials/3078554/494167/article.html.</w:t>
+        <w:t xml:space="preserve">EPJ Nuclear Sciences &amp; Technologies</w:t>
+      </w:r>
+      <w:r>
+        <w:t xml:space="preserve">, 10, art. 5. Available at: https://www.epj-n.org/10.1051/epjn/2024005.</w:t>
       </w:r>
     </w:p>
     <w:p>
@@ -9829,7 +9829,7 @@
         <w:pStyle w:val="BodyText"/>
       </w:pPr>
       <w:r>
-        <w:t xml:space="preserve">Environment and Climate Change Canada, 2026.</w:t>
+        <w:t xml:space="preserve">EFNARC, 2005.</w:t>
       </w:r>
       <w:r>
         <w:t xml:space="preserve"> </w:t>
@@ -9839,10 +9839,10 @@
           <w:iCs/>
           <w:i/>
         </w:rPr>
-        <w:t xml:space="preserve">Industrial carbon pricing in Canada</w:t>
-      </w:r>
-      <w:r>
-        <w:t xml:space="preserve">. Ottawa: Government of Canada. Available at: https://www.canada.ca/en/environment-climate-change/services/climate-change/pricing-pollution-how-it-will-work/putting-price-on-carbon-pollution/industry.html [Accessed 21 October 2026].</w:t>
+        <w:t xml:space="preserve">The European Guidelines for Self-Compacting Concrete: Specification, Production and Use</w:t>
+      </w:r>
+      <w:r>
+        <w:t xml:space="preserve">. Farnham: EFNARC.</w:t>
       </w:r>
     </w:p>
     <w:p>
@@ -9850,7 +9850,7 @@
         <w:pStyle w:val="BodyText"/>
       </w:pPr>
       <w:r>
-        <w:t xml:space="preserve">Fermi Energia, n.d.</w:t>
+        <w:t xml:space="preserve">ENR, 2018. Clay and limestone cement could cut carbon emissions.</w:t>
       </w:r>
       <w:r>
         <w:t xml:space="preserve"> </w:t>
@@ -9860,10 +9860,10 @@
           <w:iCs/>
           <w:i/>
         </w:rPr>
-        <w:t xml:space="preserve">New SMR project</w:t>
-      </w:r>
-      <w:r>
-        <w:t xml:space="preserve">. [online] Tallinn: Fermi Energia. Available at: https://fermi.ee/new-smr-project/ [Accessed 25 October 2026].</w:t>
+        <w:t xml:space="preserve">Engineering News-Record</w:t>
+      </w:r>
+      <w:r>
+        <w:t xml:space="preserve">, 7 May. Available at: https://digital.bnpmedia.com/article/Construction+Materials/3078554/494167/article.html.</w:t>
       </w:r>
     </w:p>
     <w:p>
@@ -9871,7 +9871,7 @@
         <w:pStyle w:val="BodyText"/>
       </w:pPr>
       <w:r>
-        <w:t xml:space="preserve">Field, K.G., Remec, I. and Le Pape, Y., 2015. Radiation effects in concrete for nuclear power plants – Part I: Quantification of radiation exposure and radiation effects.</w:t>
+        <w:t xml:space="preserve">Environment and Climate Change Canada, 2026.</w:t>
       </w:r>
       <w:r>
         <w:t xml:space="preserve"> </w:t>
@@ -9881,10 +9881,10 @@
           <w:iCs/>
           <w:i/>
         </w:rPr>
-        <w:t xml:space="preserve">Nuclear Engineering and Design</w:t>
-      </w:r>
-      <w:r>
-        <w:t xml:space="preserve">, 282, pp.126–143. Available at: https://www.ornl.gov/publication/radiation-effects-concrete-nuclear-power-plants-part-i-quantification-radiation [Accessed 25 October 2026].</w:t>
+        <w:t xml:space="preserve">Industrial carbon pricing in Canada</w:t>
+      </w:r>
+      <w:r>
+        <w:t xml:space="preserve">. Ottawa: Government of Canada. Available at: https://www.canada.ca/en/environment-climate-change/services/climate-change/pricing-pollution-how-it-will-work/putting-price-on-carbon-pollution/industry.html [Accessed 21 October 2026].</w:t>
       </w:r>
     </w:p>
     <w:p>
@@ -9892,7 +9892,7 @@
         <w:pStyle w:val="BodyText"/>
       </w:pPr>
       <w:r>
-        <w:t xml:space="preserve">GE Hitachi Nuclear Energy, n.d.</w:t>
+        <w:t xml:space="preserve">Fermi Energia, n.d.</w:t>
       </w:r>
       <w:r>
         <w:t xml:space="preserve"> </w:t>
@@ -9902,10 +9902,10 @@
           <w:iCs/>
           <w:i/>
         </w:rPr>
-        <w:t xml:space="preserve">GE Hitachi BWRX-300 fact sheet</w:t>
-      </w:r>
-      <w:r>
-        <w:t xml:space="preserve">. [pdf] Wilmington, NC: GE Hitachi Nuclear Energy. Available at: https://gevernova.com/content/dam/gepower-nuclear/global/en_US/documents/product-fact-sheets/BWRX-300_Fact_Sheet-2020.pdf [Accessed 25 October 2026].</w:t>
+        <w:t xml:space="preserve">New SMR project</w:t>
+      </w:r>
+      <w:r>
+        <w:t xml:space="preserve">. [online] Tallinn: Fermi Energia. Available at: https://fermi.ee/new-smr-project/ [Accessed 25 October 2026].</w:t>
       </w:r>
     </w:p>
     <w:p>
@@ -9913,7 +9913,7 @@
         <w:pStyle w:val="BodyText"/>
       </w:pPr>
       <w:r>
-        <w:t xml:space="preserve">GE-Hitachi Nuclear Energy, 2024.</w:t>
+        <w:t xml:space="preserve">Field, K.G., Remec, I. and Le Pape, Y., 2015. Radiation effects in concrete for nuclear power plants – Part I: Quantification of radiation exposure and radiation effects.</w:t>
       </w:r>
       <w:r>
         <w:t xml:space="preserve"> </w:t>
@@ -9923,10 +9923,10 @@
           <w:iCs/>
           <w:i/>
         </w:rPr>
-        <w:t xml:space="preserve">BWRX-300 Steel-Plate Composite Containment Vessel (SCCV) and Reactor Building Structural Design</w:t>
-      </w:r>
-      <w:r>
-        <w:t xml:space="preserve">, NEDO-33926, Revision 2 (non-proprietary), 16 August. [pdf] US NRC ADAMS ML24110A134. Available at: https://www.nrc.gov/docs/ML2411/ML24110A134.pdf [Accessed 20 October 2026].</w:t>
+        <w:t xml:space="preserve">Nuclear Engineering and Design</w:t>
+      </w:r>
+      <w:r>
+        <w:t xml:space="preserve">, 282, pp.126–143. Available at: https://www.ornl.gov/publication/radiation-effects-concrete-nuclear-power-plants-part-i-quantification-radiation [Accessed 25 October 2026].</w:t>
       </w:r>
     </w:p>
     <w:p>
@@ -9934,7 +9934,7 @@
         <w:pStyle w:val="BodyText"/>
       </w:pPr>
       <w:r>
-        <w:t xml:space="preserve">GE Vernova, n.d.</w:t>
+        <w:t xml:space="preserve">GE Hitachi Nuclear Energy, n.d.</w:t>
       </w:r>
       <w:r>
         <w:t xml:space="preserve"> </w:t>
@@ -9944,10 +9944,10 @@
           <w:iCs/>
           <w:i/>
         </w:rPr>
-        <w:t xml:space="preserve">BWRX-300 Small Modular Reactor</w:t>
-      </w:r>
-      <w:r>
-        <w:t xml:space="preserve">. [online] Available at: https://www.gevernova.com/nuclear/carbon-free-power/bwrx-300-small-modular-reactor.</w:t>
+        <w:t xml:space="preserve">GE Hitachi BWRX-300 fact sheet</w:t>
+      </w:r>
+      <w:r>
+        <w:t xml:space="preserve">. [pdf] Wilmington, NC: GE Hitachi Nuclear Energy. Available at: https://gevernova.com/content/dam/gepower-nuclear/global/en_US/documents/product-fact-sheets/BWRX-300_Fact_Sheet-2020.pdf [Accessed 25 October 2026].</w:t>
       </w:r>
     </w:p>
     <w:p>
@@ -9955,7 +9955,7 @@
         <w:pStyle w:val="BodyText"/>
       </w:pPr>
       <w:r>
-        <w:t xml:space="preserve">GE Vernova, 2026.</w:t>
+        <w:t xml:space="preserve">GE-Hitachi Nuclear Energy, 2024.</w:t>
       </w:r>
       <w:r>
         <w:t xml:space="preserve"> </w:t>
@@ -9965,10 +9965,10 @@
           <w:iCs/>
           <w:i/>
         </w:rPr>
-        <w:t xml:space="preserve">NRC issues first U.S. construction permit for BWRX-300 small modular reactor at TVA Clinch River</w:t>
-      </w:r>
-      <w:r>
-        <w:t xml:space="preserve">. [online] Press release. Available at: https://www.gevernova.com/news/press-releases/nrc-issues-first-us-construction-permit-bwrx-300-small-modular-reactor-tva-clinch-river [Accessed 25 October 2026].</w:t>
+        <w:t xml:space="preserve">BWRX-300 Steel-Plate Composite Containment Vessel (SCCV) and Reactor Building Structural Design</w:t>
+      </w:r>
+      <w:r>
+        <w:t xml:space="preserve">, NEDO-33926, Revision 2 (non-proprietary), 16 August. [pdf] US NRC ADAMS ML24110A134. Available at: https://www.nrc.gov/docs/ML2411/ML24110A134.pdf [Accessed 20 October 2026].</w:t>
       </w:r>
     </w:p>
     <w:p>
@@ -9976,7 +9976,7 @@
         <w:pStyle w:val="BodyText"/>
       </w:pPr>
       <w:r>
-        <w:t xml:space="preserve">GE Vernova Hitachi Nuclear Energy, n.d.</w:t>
+        <w:t xml:space="preserve">GE Vernova, n.d.</w:t>
       </w:r>
       <w:r>
         <w:t xml:space="preserve"> </w:t>
@@ -9986,13 +9986,10 @@
           <w:iCs/>
           <w:i/>
         </w:rPr>
-        <w:t xml:space="preserve">BWRX-300 General Description</w:t>
-      </w:r>
-      <w:r>
-        <w:t xml:space="preserve"> </w:t>
-      </w:r>
-      <w:r>
-        <w:t xml:space="preserve">(005N9751). [pdf] Wilmington, NC: GE Vernova. Available at: https://www.gevernova.com/content/dam/gevernova-nuclear/global/en_us/documents/carbon-free-power/005N9751-BWRX-300-General-Description.pdf.</w:t>
+        <w:t xml:space="preserve">BWRX-300 Small Modular Reactor</w:t>
+      </w:r>
+      <w:r>
+        <w:t xml:space="preserve">. [online] Available at: https://www.gevernova.com/nuclear/carbon-free-power/bwrx-300-small-modular-reactor.</w:t>
       </w:r>
     </w:p>
     <w:p>
@@ -10000,7 +9997,7 @@
         <w:pStyle w:val="BodyText"/>
       </w:pPr>
       <w:r>
-        <w:t xml:space="preserve">Geneski, N., McKellar, J.M. and Atkinson, K.D., n.d. Life cycle environmental impacts of small modular reactors: BWRX-300 Darlington project.</w:t>
+        <w:t xml:space="preserve">GE Vernova, 2026.</w:t>
       </w:r>
       <w:r>
         <w:t xml:space="preserve"> </w:t>
@@ -10010,10 +10007,10 @@
           <w:iCs/>
           <w:i/>
         </w:rPr>
-        <w:t xml:space="preserve">Proceedings of the Canadian Nuclear Society</w:t>
-      </w:r>
-      <w:r>
-        <w:t xml:space="preserve">. Available at: https://proceedings.cns-snc.ca/index.php/pcns/article/view/7692.</w:t>
+        <w:t xml:space="preserve">NRC issues first U.S. construction permit for BWRX-300 small modular reactor at TVA Clinch River</w:t>
+      </w:r>
+      <w:r>
+        <w:t xml:space="preserve">. [online] Press release. Available at: https://www.gevernova.com/news/press-releases/nrc-issues-first-us-construction-permit-bwrx-300-small-modular-reactor-tva-clinch-river [Accessed 25 October 2026].</w:t>
       </w:r>
     </w:p>
     <w:p>
@@ -10021,7 +10018,7 @@
         <w:pStyle w:val="BodyText"/>
       </w:pPr>
       <w:r>
-        <w:t xml:space="preserve">Gibon, T. and Hahn Menacho, Á., 2023. Parametric life cycle assessment of nuclear power for simplified models.</w:t>
+        <w:t xml:space="preserve">GE Vernova Hitachi Nuclear Energy, n.d.</w:t>
       </w:r>
       <w:r>
         <w:t xml:space="preserve"> </w:t>
@@ -10031,10 +10028,13 @@
           <w:iCs/>
           <w:i/>
         </w:rPr>
-        <w:t xml:space="preserve">Environmental Science &amp; Technology</w:t>
-      </w:r>
-      <w:r>
-        <w:t xml:space="preserve">, 57(38), pp.14194–14205. Available at: https://doi.org/10.1021/acs.est.3c03190.</w:t>
+        <w:t xml:space="preserve">BWRX-300 General Description</w:t>
+      </w:r>
+      <w:r>
+        <w:t xml:space="preserve"> </w:t>
+      </w:r>
+      <w:r>
+        <w:t xml:space="preserve">(005N9751). [pdf] Wilmington, NC: GE Vernova. Available at: https://www.gevernova.com/content/dam/gevernova-nuclear/global/en_us/documents/carbon-free-power/005N9751-BWRX-300-General-Description.pdf.</w:t>
       </w:r>
     </w:p>
     <w:p>
@@ -10042,7 +10042,7 @@
         <w:pStyle w:val="BodyText"/>
       </w:pPr>
       <w:r>
-        <w:t xml:space="preserve">Government of Ontario, 2025.</w:t>
+        <w:t xml:space="preserve">Geneski, N., McKellar, J.M. and Atkinson, K.D., n.d. Life cycle environmental impacts of small modular reactors: BWRX-300 Darlington project.</w:t>
       </w:r>
       <w:r>
         <w:t xml:space="preserve"> </w:t>
@@ -10052,10 +10052,10 @@
           <w:iCs/>
           <w:i/>
         </w:rPr>
-        <w:t xml:space="preserve">Ontario Leads the G7 by Building First Small Modular Reactor</w:t>
-      </w:r>
-      <w:r>
-        <w:t xml:space="preserve">. [news release] 8 May. Toronto: Government of Ontario.</w:t>
+        <w:t xml:space="preserve">Proceedings of the Canadian Nuclear Society</w:t>
+      </w:r>
+      <w:r>
+        <w:t xml:space="preserve">. Available at: https://proceedings.cns-snc.ca/index.php/pcns/article/view/7692.</w:t>
       </w:r>
     </w:p>
     <w:p>
@@ -10063,7 +10063,7 @@
         <w:pStyle w:val="BodyText"/>
       </w:pPr>
       <w:r>
-        <w:t xml:space="preserve">Government of Ontario, n.d.</w:t>
+        <w:t xml:space="preserve">Gibon, T. and Hahn Menacho, Á., 2023. Parametric life cycle assessment of nuclear power for simplified models.</w:t>
       </w:r>
       <w:r>
         <w:t xml:space="preserve"> </w:t>
@@ -10073,10 +10073,10 @@
           <w:iCs/>
           <w:i/>
         </w:rPr>
-        <w:t xml:space="preserve">Ontario energy snapshot</w:t>
-      </w:r>
-      <w:r>
-        <w:t xml:space="preserve">. [online] Available at: https://www.ontario.ca/page/ontario-energy-snapshot.</w:t>
+        <w:t xml:space="preserve">Environmental Science &amp; Technology</w:t>
+      </w:r>
+      <w:r>
+        <w:t xml:space="preserve">, 57(38), pp.14194–14205. Available at: https://doi.org/10.1021/acs.est.3c03190.</w:t>
       </w:r>
     </w:p>
     <w:p>
@@ -10084,7 +10084,7 @@
         <w:pStyle w:val="BodyText"/>
       </w:pPr>
       <w:r>
-        <w:t xml:space="preserve">Graham, P. and Hayward, J., 2026.</w:t>
+        <w:t xml:space="preserve">Government of Canada, 2026.</w:t>
       </w:r>
       <w:r>
         <w:t xml:space="preserve"> </w:t>
@@ -10094,10 +10094,10 @@
           <w:iCs/>
           <w:i/>
         </w:rPr>
-        <w:t xml:space="preserve">GenCost 2025-26: Final report</w:t>
-      </w:r>
-      <w:r>
-        <w:t xml:space="preserve">. [pdf] Australia: CSIRO. Available at: https://www.csiro.au/-/media/Energy/GenCost-2025-26-Final/GenCost_2025-26_Final_Report_20260715.pdf.</w:t>
+        <w:t xml:space="preserve">Darlington New Nuclear Project</w:t>
+      </w:r>
+      <w:r>
+        <w:t xml:space="preserve">. [online] Ottawa: Major Projects Office, updated 8 July 2026. Available at: https://www.canada.ca/en/privy-council/major-projects-office/projects/national/darlington.html [Accessed 25 October 2026].</w:t>
       </w:r>
     </w:p>
     <w:p>
@@ -10105,7 +10105,7 @@
         <w:pStyle w:val="BodyText"/>
       </w:pPr>
       <w:r>
-        <w:t xml:space="preserve">Graham, P., Hayward, J. and Foster, J., 2024.</w:t>
+        <w:t xml:space="preserve">Government of Ontario, 2025.</w:t>
       </w:r>
       <w:r>
         <w:t xml:space="preserve"> </w:t>
@@ -10115,10 +10115,10 @@
           <w:iCs/>
           <w:i/>
         </w:rPr>
-        <w:t xml:space="preserve">GenCost 2023-24: Final report</w:t>
-      </w:r>
-      <w:r>
-        <w:t xml:space="preserve">. [pdf] Australia: CSIRO. Available at: https://www.csiro.au/-/media/Energy/GenCost/GenCost2023-24Final_20240522.pdf.</w:t>
+        <w:t xml:space="preserve">Ontario Leads the G7 by Building First Small Modular Reactor</w:t>
+      </w:r>
+      <w:r>
+        <w:t xml:space="preserve">. [news release] 8 May. Toronto: Government of Ontario.</w:t>
       </w:r>
     </w:p>
     <w:p>
@@ -10126,7 +10126,7 @@
         <w:pStyle w:val="BodyText"/>
       </w:pPr>
       <w:r>
-        <w:t xml:space="preserve">Graham, P., Hayward, J. and Foster, J., 2025.</w:t>
+        <w:t xml:space="preserve">Government of Ontario, n.d.</w:t>
       </w:r>
       <w:r>
         <w:t xml:space="preserve"> </w:t>
@@ -10136,10 +10136,10 @@
           <w:iCs/>
           <w:i/>
         </w:rPr>
-        <w:t xml:space="preserve">GenCost 2024-25: Final report</w:t>
-      </w:r>
-      <w:r>
-        <w:t xml:space="preserve">. [pdf] Australia: CSIRO. Executive summary available at: https://www.csiro.au/-/media/Energy/GenCost/GenCost2024-25Final_ES.pdf.</w:t>
+        <w:t xml:space="preserve">Ontario energy snapshot</w:t>
+      </w:r>
+      <w:r>
+        <w:t xml:space="preserve">. [online] Available at: https://www.ontario.ca/page/ontario-energy-snapshot.</w:t>
       </w:r>
     </w:p>
     <w:p>
@@ -10147,7 +10147,7 @@
         <w:pStyle w:val="BodyText"/>
       </w:pPr>
       <w:r>
-        <w:t xml:space="preserve">Griffith University Climate Action Beacon and Monash Climate Change Communication Research Hub, 2025.</w:t>
+        <w:t xml:space="preserve">Graham, P. and Hayward, J., 2026.</w:t>
       </w:r>
       <w:r>
         <w:t xml:space="preserve"> </w:t>
@@ -10157,10 +10157,10 @@
           <w:iCs/>
           <w:i/>
         </w:rPr>
-        <w:t xml:space="preserve">What Australians really think of nuclear power</w:t>
-      </w:r>
-      <w:r>
-        <w:t xml:space="preserve">. [news release] 2 May. Available at: https://news.griffith.edu.au/2025/05/02/what-australians-really-think-of-nuclear-power/ [Accessed 21 October 2026].</w:t>
+        <w:t xml:space="preserve">GenCost 2025-26: Final report</w:t>
+      </w:r>
+      <w:r>
+        <w:t xml:space="preserve">. [pdf] Australia: CSIRO. Available at: https://www.csiro.au/-/media/Energy/GenCost-2025-26-Final/GenCost_2025-26_Final_Report_20260715.pdf.</w:t>
       </w:r>
     </w:p>
     <w:p>
@@ -10168,23 +10168,7 @@
         <w:pStyle w:val="BodyText"/>
       </w:pPr>
       <w:r>
-        <w:t xml:space="preserve">Helmholtz-Zentrum Dresden-Rossendorf, n.d. [Activation of the biological shield of Greifswald NPP Unit 2]. Publication Publ-39008. Dresden: Helmholtz-Zentrum Dresden-Rossendorf. Available at: https://hzdr.de/publications/Publ-39008 [Accessed 25 October 2026].</w:t>
-      </w:r>
-    </w:p>
-    <w:p>
-      <w:pPr>
-        <w:pStyle w:val="BodyText"/>
-      </w:pPr>
-      <w:r>
-        <w:t xml:space="preserve">Hooton, R.D., 2023. [Webinar slides on changes to ASTM cement and concrete standards]. ACI Fall 2023 webinar slides. [pdf] Farmington Hills: American Concrete Institute. Available at: https://www.concrete.org/portals/0/files/pdf/webinars/ws_F23_NEU_DouglasHooton.pdf [Accessed 20 October 2026].</w:t>
-      </w:r>
-    </w:p>
-    <w:p>
-      <w:pPr>
-        <w:pStyle w:val="BodyText"/>
-      </w:pPr>
-      <w:r>
-        <w:t xml:space="preserve">Independent Electricity System Operator, 2024.</w:t>
+        <w:t xml:space="preserve">Graham, P., Hayward, J. and Foster, J., 2024.</w:t>
       </w:r>
       <w:r>
         <w:t xml:space="preserve"> </w:t>
@@ -10194,10 +10178,10 @@
           <w:iCs/>
           <w:i/>
         </w:rPr>
-        <w:t xml:space="preserve">Ontario’s Energy Future: Spring 2024 Update</w:t>
-      </w:r>
-      <w:r>
-        <w:t xml:space="preserve">. [pdf] Toronto: Independent Electricity System Operator. Available at: https://www.ieso.ca/-/media/Files/IESO/Document-Library/Decarbonization-Hub/IESO-Ontarios-Energy-Future-Spring-2024.pdf.</w:t>
+        <w:t xml:space="preserve">GenCost 2023-24: Final report</w:t>
+      </w:r>
+      <w:r>
+        <w:t xml:space="preserve">. [pdf] Australia: CSIRO. Available at: https://www.csiro.au/-/media/Energy/GenCost/GenCost2023-24Final_20240522.pdf.</w:t>
       </w:r>
     </w:p>
     <w:p>
@@ -10205,7 +10189,7 @@
         <w:pStyle w:val="BodyText"/>
       </w:pPr>
       <w:r>
-        <w:t xml:space="preserve">International Atomic Energy Agency, 2024.</w:t>
+        <w:t xml:space="preserve">Graham, P., Hayward, J. and Foster, J., 2025.</w:t>
       </w:r>
       <w:r>
         <w:t xml:space="preserve"> </w:t>
@@ -10215,10 +10199,10 @@
           <w:iCs/>
           <w:i/>
         </w:rPr>
-        <w:t xml:space="preserve">Small Modular Reactors: Advances in SMR Developments 2024</w:t>
-      </w:r>
-      <w:r>
-        <w:t xml:space="preserve">. Vienna: International Atomic Energy Agency.</w:t>
+        <w:t xml:space="preserve">GenCost 2024-25: Final report</w:t>
+      </w:r>
+      <w:r>
+        <w:t xml:space="preserve">. [pdf] Australia: CSIRO. Executive summary available at: https://www.csiro.au/-/media/Energy/GenCost/GenCost2024-25Final_ES.pdf.</w:t>
       </w:r>
     </w:p>
     <w:p>
@@ -10226,7 +10210,7 @@
         <w:pStyle w:val="BodyText"/>
       </w:pPr>
       <w:r>
-        <w:t xml:space="preserve">International Energy Agency, 2022.</w:t>
+        <w:t xml:space="preserve">Griffith University Climate Action Beacon and Monash Climate Change Communication Research Hub, 2025.</w:t>
       </w:r>
       <w:r>
         <w:t xml:space="preserve"> </w:t>
@@ -10236,10 +10220,10 @@
           <w:iCs/>
           <w:i/>
         </w:rPr>
-        <w:t xml:space="preserve">Solar PV Global Supply Chains</w:t>
-      </w:r>
-      <w:r>
-        <w:t xml:space="preserve">. Paris: International Energy Agency. Available at: https://www.iea.org/reports/solar-pv-global-supply-chains [Accessed 21 October 2026].</w:t>
+        <w:t xml:space="preserve">What Australians really think of nuclear power</w:t>
+      </w:r>
+      <w:r>
+        <w:t xml:space="preserve">. [news release] 2 May. Available at: https://news.griffith.edu.au/2025/05/02/what-australians-really-think-of-nuclear-power/ [Accessed 21 October 2026].</w:t>
       </w:r>
     </w:p>
     <w:p>
@@ -10247,7 +10231,23 @@
         <w:pStyle w:val="BodyText"/>
       </w:pPr>
       <w:r>
-        <w:t xml:space="preserve">International Organization for Standardization, 2006a.</w:t>
+        <w:t xml:space="preserve">Helmholtz-Zentrum Dresden-Rossendorf, n.d. [Activation of the biological shield of Greifswald NPP Unit 2]. Publication Publ-39008. Dresden: Helmholtz-Zentrum Dresden-Rossendorf. Available at: https://hzdr.de/publications/Publ-39008 [Accessed 25 October 2026].</w:t>
+      </w:r>
+    </w:p>
+    <w:p>
+      <w:pPr>
+        <w:pStyle w:val="BodyText"/>
+      </w:pPr>
+      <w:r>
+        <w:t xml:space="preserve">Hooton, R.D., 2023. [Webinar slides on changes to ASTM cement and concrete standards]. ACI Fall 2023 webinar slides. [pdf] Farmington Hills: American Concrete Institute. Available at: https://www.concrete.org/portals/0/files/pdf/webinars/ws_F23_NEU_DouglasHooton.pdf [Accessed 20 October 2026].</w:t>
+      </w:r>
+    </w:p>
+    <w:p>
+      <w:pPr>
+        <w:pStyle w:val="BodyText"/>
+      </w:pPr>
+      <w:r>
+        <w:t xml:space="preserve">Independent Electricity System Operator, 2024.</w:t>
       </w:r>
       <w:r>
         <w:t xml:space="preserve"> </w:t>
@@ -10257,10 +10257,10 @@
           <w:iCs/>
           <w:i/>
         </w:rPr>
-        <w:t xml:space="preserve">ISO 14040:2006 Environmental management — Life cycle assessment — Principles and framework</w:t>
-      </w:r>
-      <w:r>
-        <w:t xml:space="preserve">. Geneva: International Organization for Standardization.</w:t>
+        <w:t xml:space="preserve">Ontario’s Energy Future: Spring 2024 Update</w:t>
+      </w:r>
+      <w:r>
+        <w:t xml:space="preserve">. [pdf] Toronto: Independent Electricity System Operator. Available at: https://www.ieso.ca/-/media/Files/IESO/Document-Library/Decarbonization-Hub/IESO-Ontarios-Energy-Future-Spring-2024.pdf.</w:t>
       </w:r>
     </w:p>
     <w:p>
@@ -10268,7 +10268,7 @@
         <w:pStyle w:val="BodyText"/>
       </w:pPr>
       <w:r>
-        <w:t xml:space="preserve">International Organization for Standardization, 2006b.</w:t>
+        <w:t xml:space="preserve">International Atomic Energy Agency, 2023.</w:t>
       </w:r>
       <w:r>
         <w:t xml:space="preserve"> </w:t>
@@ -10278,10 +10278,13 @@
           <w:iCs/>
           <w:i/>
         </w:rPr>
-        <w:t xml:space="preserve">ISO 14044:2006 Environmental management — Life cycle assessment — Requirements and guidelines</w:t>
-      </w:r>
-      <w:r>
-        <w:t xml:space="preserve">. Geneva: International Organization for Standardization. Available at: https://www.iso.org/standard/38498.html.</w:t>
+        <w:t xml:space="preserve">What are small modular reactors (SMRs)?</w:t>
+      </w:r>
+      <w:r>
+        <w:t xml:space="preserve"> </w:t>
+      </w:r>
+      <w:r>
+        <w:t xml:space="preserve">[online] Vienna: International Atomic Energy Agency. Available at: https://www.iaea.org/newscenter/news/what-are-small-modular-reactors-smrs [Accessed 25 October 2026].</w:t>
       </w:r>
     </w:p>
     <w:p>
@@ -10289,7 +10292,7 @@
         <w:pStyle w:val="BodyText"/>
       </w:pPr>
       <w:r>
-        <w:t xml:space="preserve">IPCC, 2006.</w:t>
+        <w:t xml:space="preserve">International Atomic Energy Agency, 2024.</w:t>
       </w:r>
       <w:r>
         <w:t xml:space="preserve"> </w:t>
@@ -10299,10 +10302,10 @@
           <w:iCs/>
           <w:i/>
         </w:rPr>
-        <w:t xml:space="preserve">2006 IPCC Guidelines for National Greenhouse Gas Inventories</w:t>
-      </w:r>
-      <w:r>
-        <w:t xml:space="preserve">, Vol. 2 Energy, Ch. 2, Table 2.2. Hayama: Institute for Global Environmental Strategies.</w:t>
+        <w:t xml:space="preserve">Small Modular Reactors: Advances in SMR Developments 2024</w:t>
+      </w:r>
+      <w:r>
+        <w:t xml:space="preserve">. Vienna: International Atomic Energy Agency.</w:t>
       </w:r>
     </w:p>
     <w:p>
@@ -10310,7 +10313,7 @@
         <w:pStyle w:val="BodyText"/>
       </w:pPr>
       <w:r>
-        <w:t xml:space="preserve">Joint Standing Committee on Treaties, 2024.</w:t>
+        <w:t xml:space="preserve">International Energy Agency, 2022.</w:t>
       </w:r>
       <w:r>
         <w:t xml:space="preserve"> </w:t>
@@ -10320,25 +10323,10 @@
           <w:iCs/>
           <w:i/>
         </w:rPr>
-        <w:t xml:space="preserve">Report 224: Agreement among Australia, the UK and the US for cooperation related to naval nuclear propulsion</w:t>
-      </w:r>
-      <w:r>
-        <w:t xml:space="preserve">, Chapter 6,</w:t>
-      </w:r>
-      <w:r>
-        <w:t xml:space="preserve"> </w:t>
-      </w:r>
-      <w:r>
-        <w:t xml:space="preserve">‘</w:t>
-      </w:r>
-      <w:r>
-        <w:t xml:space="preserve">Employment and education impacts</w:t>
-      </w:r>
-      <w:r>
-        <w:t xml:space="preserve">’</w:t>
-      </w:r>
-      <w:r>
-        <w:t xml:space="preserve">. Canberra: Parliament of Australia. Available at: https://www.aph.gov.au/Parliamentary_Business/Committees/Joint/Treaties/NuclearPropulsion/Report/Chapter_6_-_Employment_and_education_impacts [Accessed 21 October 2026].</w:t>
+        <w:t xml:space="preserve">Solar PV Global Supply Chains</w:t>
+      </w:r>
+      <w:r>
+        <w:t xml:space="preserve">. Paris: International Energy Agency. Available at: https://www.iea.org/reports/solar-pv-global-supply-chains [Accessed 21 October 2026].</w:t>
       </w:r>
     </w:p>
     <w:p>
@@ -10346,7 +10334,7 @@
         <w:pStyle w:val="BodyText"/>
       </w:pPr>
       <w:r>
-        <w:t xml:space="preserve">Kazatomprom, 2025.</w:t>
+        <w:t xml:space="preserve">International Organization for Standardization, 2006a.</w:t>
       </w:r>
       <w:r>
         <w:t xml:space="preserve"> </w:t>
@@ -10356,10 +10344,10 @@
           <w:iCs/>
           <w:i/>
         </w:rPr>
-        <w:t xml:space="preserve">Integrated Annual Report 2024</w:t>
-      </w:r>
-      <w:r>
-        <w:t xml:space="preserve">. [pdf] Astana: NAC Kazatomprom JSC. Available at: https://www.kazatomprom.kz/storage/59/kap_iar_2024_eng_0205__clean.pdf [Accessed 20 October 2026].</w:t>
+        <w:t xml:space="preserve">ISO 14040:2006 Environmental management — Life cycle assessment — Principles and framework</w:t>
+      </w:r>
+      <w:r>
+        <w:t xml:space="preserve">. Geneva: International Organization for Standardization.</w:t>
       </w:r>
     </w:p>
     <w:p>
@@ -10367,7 +10355,7 @@
         <w:pStyle w:val="BodyText"/>
       </w:pPr>
       <w:r>
-        <w:t xml:space="preserve">Kim and Macfarlane, 2026.</w:t>
+        <w:t xml:space="preserve">International Organization for Standardization, 2006b.</w:t>
       </w:r>
       <w:r>
         <w:t xml:space="preserve"> </w:t>
@@ -10377,10 +10365,10 @@
           <w:iCs/>
           <w:i/>
         </w:rPr>
-        <w:t xml:space="preserve">Challenges of small modular reactors: a comprehensive exploration</w:t>
-      </w:r>
-      <w:r>
-        <w:t xml:space="preserve">. [pdf] Available at: https://www.nirs.org/wp-content/uploads/2025/09/SMR-Costs_Challenges-of-SMRs-cost-waste_Kim-Macfarlane_2026.pdf.</w:t>
+        <w:t xml:space="preserve">ISO 14044:2006 Environmental management — Life cycle assessment — Requirements and guidelines</w:t>
+      </w:r>
+      <w:r>
+        <w:t xml:space="preserve">. Geneva: International Organization for Standardization. Available at: https://www.iso.org/standard/38498.html.</w:t>
       </w:r>
     </w:p>
     <w:p>
@@ -10388,7 +10376,7 @@
         <w:pStyle w:val="BodyText"/>
       </w:pPr>
       <w:r>
-        <w:t xml:space="preserve">Krall, L.M., Macfarlane, A.M. and Ewing, R.C., 2022. Nuclear waste from small modular reactors.</w:t>
+        <w:t xml:space="preserve">IPCC, 2006.</w:t>
       </w:r>
       <w:r>
         <w:t xml:space="preserve"> </w:t>
@@ -10398,10 +10386,10 @@
           <w:iCs/>
           <w:i/>
         </w:rPr>
-        <w:t xml:space="preserve">Proceedings of the National Academy of Sciences of the United States of America</w:t>
-      </w:r>
-      <w:r>
-        <w:t xml:space="preserve">, 119(23), e2111833119. Available at: https://doi.org/10.1073/pnas.2111833119 [Accessed 25 October 2026].</w:t>
+        <w:t xml:space="preserve">2006 IPCC Guidelines for National Greenhouse Gas Inventories</w:t>
+      </w:r>
+      <w:r>
+        <w:t xml:space="preserve">, Vol. 2 Energy, Ch. 2, Table 2.2. Hayama: Institute for Global Environmental Strategies.</w:t>
       </w:r>
     </w:p>
     <w:p>
@@ -10409,7 +10397,7 @@
         <w:pStyle w:val="BodyText"/>
       </w:pPr>
       <w:r>
-        <w:t xml:space="preserve">LACCEI, 2026. Comparative life cycle assessment and structural performance analysis of eco-friendly LC3 cement for CO₂ reduction compared to Portland cement. In:</w:t>
+        <w:t xml:space="preserve">Joint Standing Committee on Treaties, 2024.</w:t>
       </w:r>
       <w:r>
         <w:t xml:space="preserve"> </w:t>
@@ -10419,10 +10407,25 @@
           <w:iCs/>
           <w:i/>
         </w:rPr>
-        <w:t xml:space="preserve">Proceedings of the 24th LACCEI International Multi-Conference for Engineering, Education and Technology</w:t>
-      </w:r>
-      <w:r>
-        <w:t xml:space="preserve">, Santiago, Chile, 15–17 July 2026. Contribution 2661. Available at: https://laccei.org/LACCEI2026-Chile/full-papers/Contribution_2661_final_a.pdf.</w:t>
+        <w:t xml:space="preserve">Report 224: Agreement among Australia, the UK and the US for cooperation related to naval nuclear propulsion</w:t>
+      </w:r>
+      <w:r>
+        <w:t xml:space="preserve">, Chapter 6,</w:t>
+      </w:r>
+      <w:r>
+        <w:t xml:space="preserve"> </w:t>
+      </w:r>
+      <w:r>
+        <w:t xml:space="preserve">‘</w:t>
+      </w:r>
+      <w:r>
+        <w:t xml:space="preserve">Employment and education impacts</w:t>
+      </w:r>
+      <w:r>
+        <w:t xml:space="preserve">’</w:t>
+      </w:r>
+      <w:r>
+        <w:t xml:space="preserve">. Canberra: Parliament of Australia. Available at: https://www.aph.gov.au/Parliamentary_Business/Committees/Joint/Treaties/NuclearPropulsion/Report/Chapter_6_-_Employment_and_education_impacts [Accessed 21 October 2026].</w:t>
       </w:r>
     </w:p>
     <w:p>
@@ -10430,7 +10433,7 @@
         <w:pStyle w:val="BodyText"/>
       </w:pPr>
       <w:r>
-        <w:t xml:space="preserve">LC3 Project, 2015.</w:t>
+        <w:t xml:space="preserve">Kazatomprom, 2025.</w:t>
       </w:r>
       <w:r>
         <w:t xml:space="preserve"> </w:t>
@@ -10440,13 +10443,10 @@
           <w:iCs/>
           <w:i/>
         </w:rPr>
-        <w:t xml:space="preserve">LCA of LC3: India team progress</w:t>
-      </w:r>
-      <w:r>
-        <w:t xml:space="preserve"> </w:t>
-      </w:r>
-      <w:r>
-        <w:t xml:space="preserve">(industry meeting, September 2015). Available at: https://lc3.ch/wp-content/uploads/2023/03/LCA-of-LC3-India-team-progress-Industry-meeting-Sep-2015.pdf.</w:t>
+        <w:t xml:space="preserve">Integrated Annual Report 2024</w:t>
+      </w:r>
+      <w:r>
+        <w:t xml:space="preserve">. [pdf] Astana: NAC Kazatomprom JSC. Available at: https://www.kazatomprom.kz/storage/59/kap_iar_2024_eng_0205__clean.pdf [Accessed 20 October 2026].</w:t>
       </w:r>
     </w:p>
     <w:p>
@@ -10454,7 +10454,7 @@
         <w:pStyle w:val="BodyText"/>
       </w:pPr>
       <w:r>
-        <w:t xml:space="preserve">Liberal Party of Australia, 2026.</w:t>
+        <w:t xml:space="preserve">Kim and Macfarlane, 2026.</w:t>
       </w:r>
       <w:r>
         <w:t xml:space="preserve"> </w:t>
@@ -10464,10 +10464,10 @@
           <w:iCs/>
           <w:i/>
         </w:rPr>
-        <w:t xml:space="preserve">Our Plan for Cheaper Power</w:t>
-      </w:r>
-      <w:r>
-        <w:t xml:space="preserve">. [online] Available at: https://www.liberal.org.au/our-plan/energy [Accessed 20 October 2026].</w:t>
+        <w:t xml:space="preserve">Challenges of small modular reactors: a comprehensive exploration</w:t>
+      </w:r>
+      <w:r>
+        <w:t xml:space="preserve">. [pdf] Available at: https://www.nirs.org/wp-content/uploads/2025/09/SMR-Costs_Challenges-of-SMRs-cost-waste_Kim-Macfarlane_2026.pdf.</w:t>
       </w:r>
     </w:p>
     <w:p>
@@ -10475,7 +10475,7 @@
         <w:pStyle w:val="BodyText"/>
       </w:pPr>
       <w:r>
-        <w:t xml:space="preserve">Markandya, A. and Wilkinson, P., 2007. Electricity generation and health.</w:t>
+        <w:t xml:space="preserve">Krall, L.M., Macfarlane, A.M. and Ewing, R.C., 2022. Nuclear waste from small modular reactors.</w:t>
       </w:r>
       <w:r>
         <w:t xml:space="preserve"> </w:t>
@@ -10485,10 +10485,10 @@
           <w:iCs/>
           <w:i/>
         </w:rPr>
-        <w:t xml:space="preserve">The Lancet</w:t>
-      </w:r>
-      <w:r>
-        <w:t xml:space="preserve">, 370(9591), pp.979–990. Available at: https://doi.org/10.1016/S0140-6736(07)61253-7 [Accessed 20 October 2026].</w:t>
+        <w:t xml:space="preserve">Proceedings of the National Academy of Sciences of the United States of America</w:t>
+      </w:r>
+      <w:r>
+        <w:t xml:space="preserve">, 119(23), e2111833119. Available at: https://doi.org/10.1073/pnas.2111833119 [Accessed 25 October 2026].</w:t>
       </w:r>
     </w:p>
     <w:p>
@@ -10496,7 +10496,7 @@
         <w:pStyle w:val="BodyText"/>
       </w:pPr>
       <w:r>
-        <w:t xml:space="preserve">Minister for Defence, 2025.</w:t>
+        <w:t xml:space="preserve">LACCEI, 2026. Comparative life cycle assessment and structural performance analysis of eco-friendly LC3 cement for CO₂ reduction compared to Portland cement. In:</w:t>
       </w:r>
       <w:r>
         <w:t xml:space="preserve"> </w:t>
@@ -10506,10 +10506,10 @@
           <w:iCs/>
           <w:i/>
         </w:rPr>
-        <w:t xml:space="preserve">An AUKUS milestone – launch of the Australian Naval Nuclear Power Safety Regulator</w:t>
-      </w:r>
-      <w:r>
-        <w:t xml:space="preserve">. [media release] 1 November. Available at: https://www.minister.defence.gov.au/media-releases/2025-11-01/aukus-milestone-launch-australian-naval-nuclear-power-safety-regulator [Accessed 20 October 2026].</w:t>
+        <w:t xml:space="preserve">Proceedings of the 24th LACCEI International Multi-Conference for Engineering, Education and Technology</w:t>
+      </w:r>
+      <w:r>
+        <w:t xml:space="preserve">, Santiago, Chile, 15–17 July 2026. Contribution 2661. Available at: https://laccei.org/LACCEI2026-Chile/full-papers/Contribution_2661_final_a.pdf.</w:t>
       </w:r>
     </w:p>
     <w:p>
@@ -10517,23 +10517,7 @@
         <w:pStyle w:val="BodyText"/>
       </w:pPr>
       <w:r>
-        <w:t xml:space="preserve">Mississaugas of Scugog Island First Nation, 2023. Written submissions to the CNSC: CMD 23-H9.18A (Darlington Waste Management Facility, January 2023); CMD 24-H2.26 (November 2023); CMD 24-H3.81 (November 2024). Available at: https://api.cnsc-ccsn.gc.ca/dms/digital-medias/CMD23-H9-18A.pdf/object [Accessed 21 October 2026].</w:t>
-      </w:r>
-    </w:p>
-    <w:p>
-      <w:pPr>
-        <w:pStyle w:val="BodyText"/>
-      </w:pPr>
-      <w:r>
-        <w:t xml:space="preserve">Municipality of Clarington, 2024. Letter / written submission to the CNSC on the DNNP licence to construct. Available at: https://api.cnsc-ccsn.gc.ca/dms/digital-medias/CMD24-H2-12.pdf/object [Accessed 21 October 2026].</w:t>
-      </w:r>
-    </w:p>
-    <w:p>
-      <w:pPr>
-        <w:pStyle w:val="BodyText"/>
-      </w:pPr>
-      <w:r>
-        <w:t xml:space="preserve">Neelam, R., 2024.</w:t>
+        <w:t xml:space="preserve">LC3 Project, 2015.</w:t>
       </w:r>
       <w:r>
         <w:t xml:space="preserve"> </w:t>
@@ -10543,10 +10527,13 @@
           <w:iCs/>
           <w:i/>
         </w:rPr>
-        <w:t xml:space="preserve">Lowy Institute Poll 2024</w:t>
-      </w:r>
-      <w:r>
-        <w:t xml:space="preserve">. Sydney: Lowy Institute. Available at: https://poll.lowyinstitute.org/report/2024/ [Accessed 20 October 2026].</w:t>
+        <w:t xml:space="preserve">LCA of LC3: India team progress</w:t>
+      </w:r>
+      <w:r>
+        <w:t xml:space="preserve"> </w:t>
+      </w:r>
+      <w:r>
+        <w:t xml:space="preserve">(industry meeting, September 2015). Available at: https://lc3.ch/wp-content/uploads/2023/03/LCA-of-LC3-India-team-progress-Industry-meeting-Sep-2015.pdf.</w:t>
       </w:r>
     </w:p>
     <w:p>
@@ -10554,7 +10541,7 @@
         <w:pStyle w:val="BodyText"/>
       </w:pPr>
       <w:r>
-        <w:t xml:space="preserve">Newcastle Herald, 2024a. AGL says Liddell site will not be used for nuclear power.</w:t>
+        <w:t xml:space="preserve">Liberal Party of Australia, 2026.</w:t>
       </w:r>
       <w:r>
         <w:t xml:space="preserve"> </w:t>
@@ -10564,10 +10551,10 @@
           <w:iCs/>
           <w:i/>
         </w:rPr>
-        <w:t xml:space="preserve">Newcastle Herald</w:t>
-      </w:r>
-      <w:r>
-        <w:t xml:space="preserve">. [online] Available at: https://www.newcastleherald.com.au/story/8557276/agl-says-liddell-site-will-not-be-used-for-nuclear-power [Accessed 20 October 2026].</w:t>
+        <w:t xml:space="preserve">Our Plan for Cheaper Power</w:t>
+      </w:r>
+      <w:r>
+        <w:t xml:space="preserve">. [online] Available at: https://www.liberal.org.au/our-plan/energy [Accessed 20 October 2026].</w:t>
       </w:r>
     </w:p>
     <w:p>
@@ -10575,7 +10562,7 @@
         <w:pStyle w:val="BodyText"/>
       </w:pPr>
       <w:r>
-        <w:t xml:space="preserve">Newcastle Herald, 2024b. Coalition government could seize Liddell for nuclear power plant; Dutton’s nuclear energy plan divides opinion in the Hunter.</w:t>
+        <w:t xml:space="preserve">Markandya, A. and Wilkinson, P., 2007. Electricity generation and health.</w:t>
       </w:r>
       <w:r>
         <w:t xml:space="preserve"> </w:t>
@@ -10585,10 +10572,10 @@
           <w:iCs/>
           <w:i/>
         </w:rPr>
-        <w:t xml:space="preserve">Newcastle Herald</w:t>
-      </w:r>
-      <w:r>
-        <w:t xml:space="preserve">. [online] Available at: https://newcastleherald.com.au/story/8670020/ and https://newcastleherald.com.au/story/8668177/ [Accessed 21 October 2026].</w:t>
+        <w:t xml:space="preserve">The Lancet</w:t>
+      </w:r>
+      <w:r>
+        <w:t xml:space="preserve">, 370(9591), pp.979–990. Available at: https://doi.org/10.1016/S0140-6736(07)61253-7 [Accessed 20 October 2026].</w:t>
       </w:r>
     </w:p>
     <w:p>
@@ -10596,7 +10583,7 @@
         <w:pStyle w:val="BodyText"/>
       </w:pPr>
       <w:r>
-        <w:t xml:space="preserve">Newspoll, 2007. National survey on nuclear power, 2–4 March 2007 (n ≈ 1,200). Published in</w:t>
+        <w:t xml:space="preserve">Minister for Defence, 2025.</w:t>
       </w:r>
       <w:r>
         <w:t xml:space="preserve"> </w:t>
@@ -10606,10 +10593,10 @@
           <w:iCs/>
           <w:i/>
         </w:rPr>
-        <w:t xml:space="preserve">The Australian</w:t>
-      </w:r>
-      <w:r>
-        <w:t xml:space="preserve">.</w:t>
+        <w:t xml:space="preserve">An AUKUS milestone – launch of the Australian Naval Nuclear Power Safety Regulator</w:t>
+      </w:r>
+      <w:r>
+        <w:t xml:space="preserve">. [media release] 1 November. Available at: https://www.minister.defence.gov.au/media-releases/2025-11-01/aukus-milestone-launch-australian-naval-nuclear-power-safety-regulator [Accessed 20 October 2026].</w:t>
       </w:r>
     </w:p>
     <w:p>
@@ -10617,7 +10604,23 @@
         <w:pStyle w:val="BodyText"/>
       </w:pPr>
       <w:r>
-        <w:t xml:space="preserve">Ng, J.H.C., Vyawahare, P., Benavides, P.T., Gan, Y., Sun, P., Boardman, R., Marcinkoski, J. and Elgowainy, A., 2025. Life-cycle greenhouse gas emissions associated with nuclear power generation in the United States.</w:t>
+        <w:t xml:space="preserve">Mississaugas of Scugog Island First Nation, 2023. Written submissions to the CNSC: CMD 23-H9.18A (Darlington Waste Management Facility, January 2023); CMD 24-H2.26 (November 2023); CMD 24-H3.81 (November 2024). Available at: https://api.cnsc-ccsn.gc.ca/dms/digital-medias/CMD23-H9-18A.pdf/object [Accessed 21 October 2026].</w:t>
+      </w:r>
+    </w:p>
+    <w:p>
+      <w:pPr>
+        <w:pStyle w:val="BodyText"/>
+      </w:pPr>
+      <w:r>
+        <w:t xml:space="preserve">Municipality of Clarington, 2024. Letter / written submission to the CNSC on the DNNP licence to construct. Available at: https://api.cnsc-ccsn.gc.ca/dms/digital-medias/CMD24-H2-12.pdf/object [Accessed 21 October 2026].</w:t>
+      </w:r>
+    </w:p>
+    <w:p>
+      <w:pPr>
+        <w:pStyle w:val="BodyText"/>
+      </w:pPr>
+      <w:r>
+        <w:t xml:space="preserve">Neelam, R., 2024.</w:t>
       </w:r>
       <w:r>
         <w:t xml:space="preserve"> </w:t>
@@ -10627,10 +10630,10 @@
           <w:iCs/>
           <w:i/>
         </w:rPr>
-        <w:t xml:space="preserve">Journal of Industrial Ecology</w:t>
-      </w:r>
-      <w:r>
-        <w:t xml:space="preserve">, 29(3), pp.719–732. Available at: https://doi.org/10.1111/jiec.70008.</w:t>
+        <w:t xml:space="preserve">Lowy Institute Poll 2024</w:t>
+      </w:r>
+      <w:r>
+        <w:t xml:space="preserve">. Sydney: Lowy Institute. Available at: https://poll.lowyinstitute.org/report/2024/ [Accessed 20 October 2026].</w:t>
       </w:r>
     </w:p>
     <w:p>
@@ -10638,7 +10641,7 @@
         <w:pStyle w:val="BodyText"/>
       </w:pPr>
       <w:r>
-        <w:t xml:space="preserve">Norton Rose Fulbright, 2025.</w:t>
+        <w:t xml:space="preserve">Newcastle Herald, 2024a. AGL says Liddell site will not be used for nuclear power.</w:t>
       </w:r>
       <w:r>
         <w:t xml:space="preserve"> </w:t>
@@ -10648,10 +10651,10 @@
           <w:iCs/>
           <w:i/>
         </w:rPr>
-        <w:t xml:space="preserve">Key amendments to the Environment Protection Reform Act 2025 and their implications for the EPBC Act</w:t>
-      </w:r>
-      <w:r>
-        <w:t xml:space="preserve">. [online] Available at: https://www.nortonrosefulbright.com/en-au/knowledge/publications/df336551/key-amendments-to-the-environment-protection-reform-act-2025-and-their-implications-for-the-epbc-act [Accessed 20 October 2026].</w:t>
+        <w:t xml:space="preserve">Newcastle Herald</w:t>
+      </w:r>
+      <w:r>
+        <w:t xml:space="preserve">. [online] Available at: https://www.newcastleherald.com.au/story/8557276/agl-says-liddell-site-will-not-be-used-for-nuclear-power [Accessed 20 October 2026].</w:t>
       </w:r>
     </w:p>
     <w:p>
@@ -10659,7 +10662,7 @@
         <w:pStyle w:val="BodyText"/>
       </w:pPr>
       <w:r>
-        <w:t xml:space="preserve">NRMCA, 2021.</w:t>
+        <w:t xml:space="preserve">Newcastle Herald, 2024b. Coalition government could seize Liddell for nuclear power plant; Dutton’s nuclear energy plan divides opinion in the Hunter.</w:t>
       </w:r>
       <w:r>
         <w:t xml:space="preserve"> </w:t>
@@ -10669,10 +10672,10 @@
           <w:iCs/>
           <w:i/>
         </w:rPr>
-        <w:t xml:space="preserve">Environmental Product Declaration EPD 20046: St Marys Cement, Bowmanville plant</w:t>
-      </w:r>
-      <w:r>
-        <w:t xml:space="preserve">. [pdf] Available at: https://www.nrmca.org/wp-content/uploads/2021/09/NRMCA_EPD20046StMarys_EPD_BOW_Sep2021.pdf.</w:t>
+        <w:t xml:space="preserve">Newcastle Herald</w:t>
+      </w:r>
+      <w:r>
+        <w:t xml:space="preserve">. [online] Available at: https://newcastleherald.com.au/story/8670020/ and https://newcastleherald.com.au/story/8668177/ [Accessed 21 October 2026].</w:t>
       </w:r>
     </w:p>
     <w:p>
@@ -10680,7 +10683,7 @@
         <w:pStyle w:val="BodyText"/>
       </w:pPr>
       <w:r>
-        <w:t xml:space="preserve">Nuclear Waste Management Organization, 2024a.</w:t>
+        <w:t xml:space="preserve">Newspoll, 2007. National survey on nuclear power, 2–4 March 2007 (n ≈ 1,200). Published in</w:t>
       </w:r>
       <w:r>
         <w:t xml:space="preserve"> </w:t>
@@ -10690,10 +10693,10 @@
           <w:iCs/>
           <w:i/>
         </w:rPr>
-        <w:t xml:space="preserve">The Nuclear Waste Management Organization selects site for Canada’s deep geological repository for used nuclear fuel</w:t>
-      </w:r>
-      <w:r>
-        <w:t xml:space="preserve">. [news release] 28 November. Toronto: Nuclear Waste Management Organization. Available at: https://www.nwmo.ca/News/The-Nuclear-Waste-Management-Organization-selects-site-for-Canadas-deep-geological-repository [Accessed 21 October 2026].</w:t>
+        <w:t xml:space="preserve">The Australian</w:t>
+      </w:r>
+      <w:r>
+        <w:t xml:space="preserve">.</w:t>
       </w:r>
     </w:p>
     <w:p>
@@ -10701,7 +10704,7 @@
         <w:pStyle w:val="BodyText"/>
       </w:pPr>
       <w:r>
-        <w:t xml:space="preserve">Nuclear Waste Management Organization, 2024b.</w:t>
+        <w:t xml:space="preserve">Ng, J.H.C., Vyawahare, P., Benavides, P.T., Gan, Y., Sun, P., Boardman, R., Marcinkoski, J. and Elgowainy, A., 2025. Life-cycle greenhouse gas emissions associated with nuclear power generation in the United States.</w:t>
       </w:r>
       <w:r>
         <w:t xml:space="preserve"> </w:t>
@@ -10711,10 +10714,10 @@
           <w:iCs/>
           <w:i/>
         </w:rPr>
-        <w:t xml:space="preserve">Implementing Adaptive Phased Management 2024–28: Selecting a site</w:t>
-      </w:r>
-      <w:r>
-        <w:t xml:space="preserve">. Available at: https://implementationplan.nwmo.ca/2024_28/selecting-a-site/ [Accessed 21 October 2026].</w:t>
+        <w:t xml:space="preserve">Journal of Industrial Ecology</w:t>
+      </w:r>
+      <w:r>
+        <w:t xml:space="preserve">, 29(3), pp.719–732. Available at: https://doi.org/10.1111/jiec.70008.</w:t>
       </w:r>
     </w:p>
     <w:p>
@@ -10722,7 +10725,7 @@
         <w:pStyle w:val="BodyText"/>
       </w:pPr>
       <w:r>
-        <w:t xml:space="preserve">Nuclear Waste Management Organization, 2024c.</w:t>
+        <w:t xml:space="preserve">Norton Rose Fulbright, 2025.</w:t>
       </w:r>
       <w:r>
         <w:t xml:space="preserve"> </w:t>
@@ -10732,10 +10735,115 @@
           <w:iCs/>
           <w:i/>
         </w:rPr>
+        <w:t xml:space="preserve">Key amendments to the Environment Protection Reform Act 2025 and their implications for the EPBC Act</w:t>
+      </w:r>
+      <w:r>
+        <w:t xml:space="preserve">. [online] Available at: https://www.nortonrosefulbright.com/en-au/knowledge/publications/df336551/key-amendments-to-the-environment-protection-reform-act-2025-and-their-implications-for-the-epbc-act [Accessed 20 October 2026].</w:t>
+      </w:r>
+    </w:p>
+    <w:p>
+      <w:pPr>
+        <w:pStyle w:val="BodyText"/>
+      </w:pPr>
+      <w:r>
+        <w:t xml:space="preserve">NRMCA, 2021.</w:t>
+      </w:r>
+      <w:r>
+        <w:t xml:space="preserve"> </w:t>
+      </w:r>
+      <w:r>
+        <w:rPr>
+          <w:iCs/>
+          <w:i/>
+        </w:rPr>
+        <w:t xml:space="preserve">Environmental Product Declaration EPD 20046: St Marys Cement, Bowmanville plant</w:t>
+      </w:r>
+      <w:r>
+        <w:t xml:space="preserve">. [pdf] Available at: https://www.nrmca.org/wp-content/uploads/2021/09/NRMCA_EPD20046StMarys_EPD_BOW_Sep2021.pdf.</w:t>
+      </w:r>
+    </w:p>
+    <w:p>
+      <w:pPr>
+        <w:pStyle w:val="BodyText"/>
+      </w:pPr>
+      <w:r>
+        <w:t xml:space="preserve">Nuclear Waste Management Organization, 2024a.</w:t>
+      </w:r>
+      <w:r>
+        <w:t xml:space="preserve"> </w:t>
+      </w:r>
+      <w:r>
+        <w:rPr>
+          <w:iCs/>
+          <w:i/>
+        </w:rPr>
+        <w:t xml:space="preserve">The Nuclear Waste Management Organization selects site for Canada’s deep geological repository for used nuclear fuel</w:t>
+      </w:r>
+      <w:r>
+        <w:t xml:space="preserve">. [news release] 28 November. Toronto: Nuclear Waste Management Organization. Available at: https://www.nwmo.ca/News/The-Nuclear-Waste-Management-Organization-selects-site-for-Canadas-deep-geological-repository [Accessed 21 October 2026].</w:t>
+      </w:r>
+    </w:p>
+    <w:p>
+      <w:pPr>
+        <w:pStyle w:val="BodyText"/>
+      </w:pPr>
+      <w:r>
+        <w:t xml:space="preserve">Nuclear Waste Management Organization, 2024b.</w:t>
+      </w:r>
+      <w:r>
+        <w:t xml:space="preserve"> </w:t>
+      </w:r>
+      <w:r>
+        <w:rPr>
+          <w:iCs/>
+          <w:i/>
+        </w:rPr>
+        <w:t xml:space="preserve">Implementing Adaptive Phased Management 2024–28: Selecting a site</w:t>
+      </w:r>
+      <w:r>
+        <w:t xml:space="preserve">. Available at: https://implementationplan.nwmo.ca/2024_28/selecting-a-site/ [Accessed 21 October 2026].</w:t>
+      </w:r>
+    </w:p>
+    <w:p>
+      <w:pPr>
+        <w:pStyle w:val="BodyText"/>
+      </w:pPr>
+      <w:r>
+        <w:t xml:space="preserve">Nuclear Waste Management Organization, 2024c.</w:t>
+      </w:r>
+      <w:r>
+        <w:t xml:space="preserve"> </w:t>
+      </w:r>
+      <w:r>
+        <w:rPr>
+          <w:iCs/>
+          <w:i/>
+        </w:rPr>
         <w:t xml:space="preserve">Mayor and Council of the Township of Ignace sign historic potential hosting agreement with the NWMO</w:t>
       </w:r>
       <w:r>
         <w:t xml:space="preserve">. [news release] March. Available at: https://www.nwmo.ca/news/mayor-and-council-of-the-township-of-ignace-sign-historic–potential-hosting-agreement-with-the-nwmo [Accessed 21 October 2026].</w:t>
+      </w:r>
+    </w:p>
+    <w:p>
+      <w:pPr>
+        <w:pStyle w:val="BodyText"/>
+      </w:pPr>
+      <w:r>
+        <w:t xml:space="preserve">Nuclear Waste Management Organization, 2026.</w:t>
+      </w:r>
+      <w:r>
+        <w:t xml:space="preserve"> </w:t>
+      </w:r>
+      <w:r>
+        <w:rPr>
+          <w:iCs/>
+          <w:i/>
+        </w:rPr>
+        <w:t xml:space="preserve">Regulatory process: deep geological repository for Canada’s used nuclear fuel project</w:t>
+      </w:r>
+      <w:r>
+        <w:t xml:space="preserve">. [online] Toronto: Nuclear Waste Management Organization. Available at: https://www.nwmo.ca/en/Regulatory-process [Accessed 25 October 2026].</w:t>
       </w:r>
     </w:p>
     <w:p>
@@ -56913,18 +57021,6 @@
         <w:t xml:space="preserve">Appendix E. Search log</w:t>
       </w:r>
     </w:p>
-    <w:p>
-      <w:pPr>
-        <w:pStyle w:val="FirstParagraph"/>
-      </w:pPr>
-      <w:r>
-        <w:rPr>
-          <w:iCs/>
-          <w:i/>
-        </w:rPr>
-        <w:t xml:space="preserve">Drafted for Leroy; Leroy may reclaim.</w:t>
-      </w:r>
-    </w:p>
     <w:bookmarkStart w:id="141" w:name="e1.-method-and-access"/>
     <w:p>
       <w:pPr>
@@ -59181,7 +59277,7 @@
               <w:jc w:val="left"/>
             </w:pPr>
             <w:r>
-              <w:t xml:space="preserve">CNSC (2023); NRC RG 1.99 Rev. 2</w:t>
+              <w:t xml:space="preserve">CNSC (2023b); NRC RG 1.99 Rev. 2</w:t>
             </w:r>
           </w:p>
         </w:tc>
@@ -60413,6 +60509,7 @@
     <w:rPr>
       <w:sz w:val="40"/>
       <w:szCs w:val="40"/>
+      <w:color w:val="006DAE"/>
     </w:rPr>
   </w:style>
   <w:style w:styleId="Heading2" w:type="paragraph">
@@ -60430,6 +60527,7 @@
       <w:bCs w:val="0"/>
       <w:sz w:val="32"/>
       <w:szCs w:val="32"/>
+      <w:color w:val="006DAE"/>
     </w:rPr>
   </w:style>
   <w:style w:styleId="Heading3" w:type="paragraph">
@@ -60448,6 +60546,7 @@
       <w:color w:val="434343"/>
       <w:sz w:val="28"/>
       <w:szCs w:val="28"/>
+      <w:color w:val="006DAE"/>
     </w:rPr>
   </w:style>
   <w:style w:styleId="Heading4" w:type="paragraph">
@@ -60513,6 +60612,7 @@
     <w:rPr>
       <w:sz w:val="52"/>
       <w:szCs w:val="52"/>
+      <w:color w:val="006DAE"/>
     </w:rPr>
   </w:style>
   <w:style w:default="1" w:styleId="Normal" w:type="paragraph">
@@ -60717,31 +60817,30 @@
   <w:style w:default="1" w:styleId="Table" w:type="table">
     <w:name w:val="Table"/>
     <w:basedOn w:val="TableNormal"/>
-    <w:semiHidden/>
-    <w:unhideWhenUsed/>
     <w:qFormat/>
+    <w:pPr>
+      <w:spacing w:after="20" w:before="20"/>
+    </w:pPr>
     <w:tblPr>
       <w:tblInd w:type="dxa" w:w="0"/>
+      <w:tblBorders>
+        <w:top w:color="006DAE" w:space="0" w:sz="8" w:val="single"/>
+        <w:bottom w:color="006DAE" w:space="0" w:sz="8" w:val="single"/>
+        <w:insideH w:color="D0D7DE" w:space="0" w:sz="4" w:val="single"/>
+      </w:tblBorders>
       <w:tblCellMar>
-        <w:top w:type="dxa" w:w="0"/>
-        <w:left w:type="dxa" w:w="108"/>
-        <w:bottom w:type="dxa" w:w="0"/>
-        <w:right w:type="dxa" w:w="108"/>
+        <w:top w:type="dxa" w:w="30"/>
+        <w:left w:type="dxa" w:w="80"/>
+        <w:bottom w:type="dxa" w:w="30"/>
+        <w:right w:type="dxa" w:w="80"/>
       </w:tblCellMar>
     </w:tblPr>
     <w:tblStylePr w:type="firstRow">
-      <w:tblPr>
-        <w:jc w:val="left"/>
-        <w:tblInd w:type="dxa" w:w="0"/>
-      </w:tblPr>
-      <w:trPr>
-        <w:jc w:val="left"/>
-      </w:trPr>
+      <w:rPr>
+        <w:b/>
+      </w:rPr>
       <w:tcPr>
-        <w:vAlign w:val="bottom"/>
-        <w:tcBorders>
-          <w:bottom w:val="single"/>
-        </w:tcBorders>
+        <w:shd w:color="auto" w:fill="DCE9F5" w:val="clear"/>
       </w:tcPr>
     </w:tblStylePr>
   </w:style>
@@ -60779,20 +60878,37 @@
     <w:pPr>
       <w:keepNext/>
     </w:pPr>
+    <w:rPr>
+      <w:color w:val="555555"/>
+      <w:sz w:val="19"/>
+      <w:szCs w:val="19"/>
+    </w:rPr>
   </w:style>
   <w:style w:customStyle="1" w:styleId="ImageCaption" w:type="paragraph">
     <w:name w:val="Image Caption"/>
     <w:basedOn w:val="Caption"/>
+    <w:rPr>
+      <w:color w:val="555555"/>
+      <w:sz w:val="19"/>
+      <w:szCs w:val="19"/>
+    </w:rPr>
+    <w:pPr>
+      <w:jc w:val="center"/>
+    </w:pPr>
   </w:style>
   <w:style w:customStyle="1" w:styleId="Figure" w:type="paragraph">
     <w:name w:val="Figure"/>
     <w:basedOn w:val="Normal"/>
+    <w:pPr>
+      <w:jc w:val="center"/>
+    </w:pPr>
   </w:style>
   <w:style w:customStyle="1" w:styleId="CaptionedFigure" w:type="paragraph">
     <w:name w:val="Captioned Figure"/>
     <w:basedOn w:val="Figure"/>
     <w:pPr>
       <w:keepNext/>
+      <w:jc w:val="center"/>
     </w:pPr>
   </w:style>
   <w:style w:customStyle="1" w:styleId="BodyTextChar" w:type="character">

</xml_diff>

<commit_message>
Merge Leroy's yellow text into 8.2, 8.4, 8.5, 9; changes view; final and team-review builds (Granta only missing)
Co-Authored-By: Claude Opus 5.5 <noreply@anthropic.com>
Claude-Session: https://claude.ai/code/session_01SZLM437PwZArBFHgvvPCk4
</commit_message>
<xml_diff>
--- a/01_Report/MTE4593 Group 9 SMR Report.docx
+++ b/01_Report/MTE4593 Group 9 SMR Report.docx
@@ -1101,7 +1101,7 @@
                 <w:bCs/>
                 <w:b/>
               </w:rPr>
-              <w:t xml:space="preserve">7.5%</w:t>
+              <w:t xml:space="preserve">11.5%</w:t>
             </w:r>
             <w:r>
               <w:t xml:space="preserve"> </w:t>
@@ -5071,7 +5071,7 @@
         <w:t xml:space="preserve"> </w:t>
       </w:r>
       <w:r>
-        <w:t xml:space="preserve">Darlington’s C$20.9 bn budget for four 300 MWe units (Ontario Power Generation, 2025a) gives a levelised cost of electricity (LCOE: the constant price that repays every cost over the plant’s life) of C$198/MWh at a 7% real discount rate, and C$112–280 from 3% to 10% (Table T8). Capital is 65–86% of it, so finance terms matter as much as engineering. OPG’s C$149/MWh implies 4.9%, a regulated Crown utility’s cost of capital. Our A$221 at 7% sits just below GenCost’s 2030 SMR range (Graham, Hayward and Foster, 2024), plausibly because four units share infrastructure. The agreement is not independent, because GenCost’s current edition bases its SMR capital cost on Darlington (Graham and Hayward, 2026). A NuScale-size overrun would give C$317/MWh.</w:t>
+        <w:t xml:space="preserve">Darlington’s C$20.9 bn budget for four 300 MWe units (Ontario Power Generation, 2025a) gives a levelised cost of electricity (LCOE: the constant price that repays every cost over the plant’s life) of C$198/MWh at a 7% real discount rate, and C$112–280 from 3% to 10% (Table T9). Capital is 65–86% of it, so finance terms matter as much as engineering. OPG’s C$149/MWh implies 4.9%, a regulated Crown utility’s cost of capital. Our A$221 at 7% sits just below GenCost’s 2030 SMR range (Graham, Hayward and Foster, 2024), plausibly because four units share infrastructure. The agreement is not independent, because GenCost’s current edition bases its SMR capital cost on Darlington (Graham and Hayward, 2026). A NuScale-size overrun would give C$317/MWh.</w:t>
       </w:r>
     </w:p>
     <w:p>
@@ -5089,7 +5089,7 @@
         <w:t xml:space="preserve"> </w:t>
       </w:r>
       <w:r>
-        <w:t xml:space="preserve">NuScale’s Idaho project shows what happens when buyers carry overrun risk: its price rose about 35% in real terms even after tax credits, the Utah utilities did not subscribe, and it was cancelled in 2023 (Table T8). Darlington avoids this with a single Crown owner and a regulated rate base; public and First Nations finance covers about 22% of the budget (§8.5). The second equity tranche is released for Units 2–4</w:t>
+        <w:t xml:space="preserve">NuScale’s Idaho project shows what happens when buyers carry overrun risk: its price rose about 35% in real terms even after tax credits, the Utah utilities did not subscribe, and it was cancelled in 2023 (Table T9). Darlington avoids this with a single Crown owner and a regulated rate base; public and First Nations finance covers about 22% of the budget (§8.5). The first unit’s C$7.7 bn, with common infrastructure, sits inside the C$20.9 bn, not on top of it. The Canada Growth Fund (up to C$2 bn) and Building Ontario Fund (up to C$1 bn) supply equity, and the C$715 m of loan guarantees behind the First Nations’ investment is credit support, not extra spending (Government of Canada, 2026). The second equity tranche is released for Units 2–4</w:t>
       </w:r>
       <w:r>
         <w:t xml:space="preserve"> </w:t>
@@ -5125,7 +5125,7 @@
         <w:t xml:space="preserve"> </w:t>
       </w:r>
       <w:r>
-        <w:t xml:space="preserve">About C$17,400/kW is at risk for years before any revenue. Equity markets value US developers on hoped-for orders (NuScale at 168 times its revenue; NuScale Power Corporation, 2026), but first plants are financed by states and rate bases: the US Department of Energy’s US$800 m went to two designs, one the BWRX-300 (US Department of Energy, 2025), out of about 70 worldwide (International Atomic Energy Agency, 2024). China’s State Council approves batches of reactors for state-owned builders, as reported (Caixin Global, 2026). Australia has neither route. Liddell belongs to AGL, a private company, so an SMR there would need Commonwealth ownership or underwriting, with taxpayers carrying the cost risk (our inference).</w:t>
+        <w:t xml:space="preserve">Entry needs large up-front capital, years of development, component qualification and regulatory approval; a small module is not proportionally cheap because site works, security and licensing are largely fixed (International Atomic Energy Agency, 2023). About C$17,400/kW is at risk for years before any revenue. Market capitalisation is a poor proxy for cost or performance: NuScale trades at 168 times its revenue (NuScale Power Corporation, 2026) because investors price hoped-for orders, not verified capital intensity or output. Darlington’s disclosed budget is a stronger benchmark, though its operating record is yet to come. First plants are financed by states and rate bases: the US Department of Energy’s US$800 m went to two designs, one the BWRX-300 (US Department of Energy, 2025), out of about 70 worldwide (International Atomic Energy Agency, 2024). China’s State Council approves batches of reactors for state-owned builders, as reported (Caixin Global, 2026). Australia has neither route. Liddell belongs to AGL, a private company, so an SMR there would need Commonwealth ownership or underwriting, with taxpayers carrying the cost risk (our inference).</w:t>
       </w:r>
     </w:p>
     <w:p>
@@ -5143,7 +5143,7 @@
         <w:t xml:space="preserve"> </w:t>
       </w:r>
       <w:r>
-        <w:t xml:space="preserve">LC³ saves 6,600 t CO₂e across Units 2–4 (2,200 t a unit; §6.3), worth C$0.63–0.76 m at the federal carbon price of C$95/t in 2026 and C$115/t in 2030 (Environment and Climate Change Canada, 2026; BWRX-300 Ostrołęka sp. z o.o., 2023; Pillai et al., 2019). That justifies an LC³ premium of up to C$10.4–12.7/m³, or 4.6–5.5% of commodity concrete at C$229/m³. The target concrete costs about C$13.7 m, 0.10% of Units 2–4 capital. No one captures the carbon value, because construction materials appear to sit outside Ontario’s industrial carbon pricing (our inference). Qualification sets the abatement cost: a C$1 m programme (assumed) adds about C$152/t, above the C$95–115/t price path, and one day of delay costs C$1.8–2.9 m, more than C1’s whole carbon value. Responses are compared and sequenced in §8.6 (Table T12).</w:t>
+        <w:t xml:space="preserve">LC³ saves 6,600 t CO₂e across Units 2–4 (2,200 t a unit; §6.3), worth C$0.63–0.76 m at the federal carbon price of C$95/t in 2026 and C$115/t in 2030 (Environment and Climate Change Canada, 2026; BWRX-300 Ostrołęka sp. z o.o., 2023; Pillai et al., 2019). That justifies an LC³ premium of up to C$10.4–12.7/m³, or 4.6–5.5% of commodity concrete at C$229/m³. The target concrete costs about C$13.7 m, 0.10% of Units 2–4 capital. Table T8 tests the break-even from the cost side, since C1 decides only the premium on a qualified mix, not the C$20.9 bn. A C$10/m³ premium on a unit’s 20,000 m³ of eligible concrete (40% of 50,000 m³) costs C$0.2 m, or C$91/t, just inside the carbon price; C$25 gives C$227/t and C$50 gives C$455/t. These are sensitivities, not quotes: no supplier price has been obtained. No one captures the carbon value, because construction materials appear to sit outside Ontario’s industrial carbon pricing (our inference). Qualification adds to the abatement cost: a C$1 m programme (assumed) adds about C$152/t, and one day of delay costs C$1.8–2.9 m, more than C1’s whole carbon value. Responses are compared and sequenced in §8.6 (Table T13).</w:t>
       </w:r>
     </w:p>
     <w:p>
@@ -5155,7 +5155,296 @@
           <w:iCs/>
           <w:i/>
         </w:rPr>
-        <w:t xml:space="preserve">Table T8. Cost evidence for an SMR: our Darlington estimate against published values.</w:t>
+        <w:t xml:space="preserve">Table T8. Material-only cost of an LC³ premium on 20,000 m³ of eligible concrete per unit, against 2,200 t CO₂e saved.</w:t>
+      </w:r>
+      <w:r>
+        <w:t xml:space="preserve"> </w:t>
+      </w:r>
+      <w:r>
+        <w:rPr>
+          <w:iCs/>
+          <w:i/>
+        </w:rPr>
+        <w:t xml:space="preserve">Source: this study; premiums assumed. Carbon price from Environment and Climate Change Canada (2026).</w:t>
+      </w:r>
+    </w:p>
+    <w:tbl>
+      <w:tblPr>
+        <w:tblStyle w:val="Table"/>
+        <w:tblW w:type="auto" w:w="0"/>
+        <w:tblLook w:firstRow="1" w:lastRow="0" w:firstColumn="0" w:lastColumn="0" w:noHBand="0" w:noVBand="0" w:val="0020"/>
+        <w:jc w:val="start"/>
+      </w:tblPr>
+      <w:tblGrid>
+        <w:gridCol w:w="1980"/>
+        <w:gridCol w:w="1980"/>
+        <w:gridCol w:w="1980"/>
+        <w:gridCol w:w="1980"/>
+      </w:tblGrid>
+      <w:tr>
+        <w:trPr>
+          <w:tblHeader w:val="true"/>
+        </w:trPr>
+        <w:tc>
+          <w:tcPr/>
+          <w:p>
+            <w:pPr>
+              <w:pStyle w:val="Compact"/>
+              <w:jc w:val="left"/>
+            </w:pPr>
+            <w:r>
+              <w:t xml:space="preserve">Premium</w:t>
+            </w:r>
+          </w:p>
+        </w:tc>
+        <w:tc>
+          <w:tcPr/>
+          <w:p>
+            <w:pPr>
+              <w:pStyle w:val="Compact"/>
+              <w:jc w:val="left"/>
+            </w:pPr>
+            <w:r>
+              <w:t xml:space="preserve">Extra cost per unit</w:t>
+            </w:r>
+          </w:p>
+        </w:tc>
+        <w:tc>
+          <w:tcPr/>
+          <w:p>
+            <w:pPr>
+              <w:pStyle w:val="Compact"/>
+              <w:jc w:val="left"/>
+            </w:pPr>
+            <w:r>
+              <w:t xml:space="preserve">Per t CO₂e saved</w:t>
+            </w:r>
+          </w:p>
+        </w:tc>
+        <w:tc>
+          <w:tcPr/>
+          <w:p>
+            <w:pPr>
+              <w:pStyle w:val="Compact"/>
+              <w:jc w:val="left"/>
+            </w:pPr>
+            <w:r>
+              <w:t xml:space="preserve">Against C$95–115/t</w:t>
+            </w:r>
+          </w:p>
+        </w:tc>
+      </w:tr>
+      <w:tr>
+        <w:tc>
+          <w:tcPr/>
+          <w:p>
+            <w:pPr>
+              <w:pStyle w:val="Compact"/>
+              <w:jc w:val="left"/>
+            </w:pPr>
+            <w:r>
+              <w:t xml:space="preserve">C$0/m³</w:t>
+            </w:r>
+          </w:p>
+        </w:tc>
+        <w:tc>
+          <w:tcPr/>
+          <w:p>
+            <w:pPr>
+              <w:pStyle w:val="Compact"/>
+              <w:jc w:val="left"/>
+            </w:pPr>
+            <w:r>
+              <w:t xml:space="preserve">C$0</w:t>
+            </w:r>
+          </w:p>
+        </w:tc>
+        <w:tc>
+          <w:tcPr/>
+          <w:p>
+            <w:pPr>
+              <w:pStyle w:val="Compact"/>
+              <w:jc w:val="left"/>
+            </w:pPr>
+            <w:r>
+              <w:t xml:space="preserve">C$0</w:t>
+            </w:r>
+          </w:p>
+        </w:tc>
+        <w:tc>
+          <w:tcPr/>
+          <w:p>
+            <w:pPr>
+              <w:pStyle w:val="Compact"/>
+              <w:jc w:val="left"/>
+            </w:pPr>
+            <w:r>
+              <w:t xml:space="preserve">Free</w:t>
+            </w:r>
+          </w:p>
+        </w:tc>
+      </w:tr>
+      <w:tr>
+        <w:tc>
+          <w:tcPr/>
+          <w:p>
+            <w:pPr>
+              <w:pStyle w:val="Compact"/>
+              <w:jc w:val="left"/>
+            </w:pPr>
+            <w:r>
+              <w:t xml:space="preserve">C$10/m³</w:t>
+            </w:r>
+          </w:p>
+        </w:tc>
+        <w:tc>
+          <w:tcPr/>
+          <w:p>
+            <w:pPr>
+              <w:pStyle w:val="Compact"/>
+              <w:jc w:val="left"/>
+            </w:pPr>
+            <w:r>
+              <w:t xml:space="preserve">C$0.2 m</w:t>
+            </w:r>
+          </w:p>
+        </w:tc>
+        <w:tc>
+          <w:tcPr/>
+          <w:p>
+            <w:pPr>
+              <w:pStyle w:val="Compact"/>
+              <w:jc w:val="left"/>
+            </w:pPr>
+            <w:r>
+              <w:t xml:space="preserve">C$91</w:t>
+            </w:r>
+          </w:p>
+        </w:tc>
+        <w:tc>
+          <w:tcPr/>
+          <w:p>
+            <w:pPr>
+              <w:pStyle w:val="Compact"/>
+              <w:jc w:val="left"/>
+            </w:pPr>
+            <w:r>
+              <w:t xml:space="preserve">Below the price</w:t>
+            </w:r>
+          </w:p>
+        </w:tc>
+      </w:tr>
+      <w:tr>
+        <w:tc>
+          <w:tcPr/>
+          <w:p>
+            <w:pPr>
+              <w:pStyle w:val="Compact"/>
+              <w:jc w:val="left"/>
+            </w:pPr>
+            <w:r>
+              <w:t xml:space="preserve">C$25/m³</w:t>
+            </w:r>
+          </w:p>
+        </w:tc>
+        <w:tc>
+          <w:tcPr/>
+          <w:p>
+            <w:pPr>
+              <w:pStyle w:val="Compact"/>
+              <w:jc w:val="left"/>
+            </w:pPr>
+            <w:r>
+              <w:t xml:space="preserve">C$0.5 m</w:t>
+            </w:r>
+          </w:p>
+        </w:tc>
+        <w:tc>
+          <w:tcPr/>
+          <w:p>
+            <w:pPr>
+              <w:pStyle w:val="Compact"/>
+              <w:jc w:val="left"/>
+            </w:pPr>
+            <w:r>
+              <w:t xml:space="preserve">C$227</w:t>
+            </w:r>
+          </w:p>
+        </w:tc>
+        <w:tc>
+          <w:tcPr/>
+          <w:p>
+            <w:pPr>
+              <w:pStyle w:val="Compact"/>
+              <w:jc w:val="left"/>
+            </w:pPr>
+            <w:r>
+              <w:t xml:space="preserve">Above the price</w:t>
+            </w:r>
+          </w:p>
+        </w:tc>
+      </w:tr>
+      <w:tr>
+        <w:tc>
+          <w:tcPr/>
+          <w:p>
+            <w:pPr>
+              <w:pStyle w:val="Compact"/>
+              <w:jc w:val="left"/>
+            </w:pPr>
+            <w:r>
+              <w:t xml:space="preserve">C$50/m³</w:t>
+            </w:r>
+          </w:p>
+        </w:tc>
+        <w:tc>
+          <w:tcPr/>
+          <w:p>
+            <w:pPr>
+              <w:pStyle w:val="Compact"/>
+              <w:jc w:val="left"/>
+            </w:pPr>
+            <w:r>
+              <w:t xml:space="preserve">C$1.0 m</w:t>
+            </w:r>
+          </w:p>
+        </w:tc>
+        <w:tc>
+          <w:tcPr/>
+          <w:p>
+            <w:pPr>
+              <w:pStyle w:val="Compact"/>
+              <w:jc w:val="left"/>
+            </w:pPr>
+            <w:r>
+              <w:t xml:space="preserve">C$455</w:t>
+            </w:r>
+          </w:p>
+        </w:tc>
+        <w:tc>
+          <w:tcPr/>
+          <w:p>
+            <w:pPr>
+              <w:pStyle w:val="Compact"/>
+              <w:jc w:val="left"/>
+            </w:pPr>
+            <w:r>
+              <w:t xml:space="preserve">Above the price</w:t>
+            </w:r>
+          </w:p>
+        </w:tc>
+      </w:tr>
+    </w:tbl>
+    <w:p>
+      <w:pPr>
+        <w:pStyle w:val="BodyText"/>
+      </w:pPr>
+      <w:r>
+        <w:rPr>
+          <w:iCs/>
+          <w:i/>
+        </w:rPr>
+        <w:t xml:space="preserve">Table T9. Cost evidence for an SMR: our Darlington estimate against published values.</w:t>
       </w:r>
       <w:r>
         <w:t xml:space="preserve"> </w:t>
@@ -5468,7 +5757,7 @@
         <w:t xml:space="preserve"> </w:t>
       </w:r>
       <w:r>
-        <w:t xml:space="preserve">on the 2023 US merger guidelines (US Department of Justice and Federal Trade Commission, 2023), though on the 2010 scale only enrichment is (Table T9). For Darlington this is a price risk; for an Australian SMR it is a sovereign risk.</w:t>
+        <w:t xml:space="preserve">on the 2023 US merger guidelines (US Department of Justice and Federal Trade Commission, 2023), though on the 2010 scale only enrichment is (Table T10). For Darlington this is a price risk; for an Australian SMR it is a sovereign risk.</w:t>
       </w:r>
     </w:p>
     <w:p>
@@ -5534,7 +5823,7 @@
           <w:iCs/>
           <w:i/>
         </w:rPr>
-        <w:t xml:space="preserve">Table T9. Herfindahl–Hirschman index (HHI) of the uranium front end, by stage, with and without Russia and China.</w:t>
+        <w:t xml:space="preserve">Table T10. Herfindahl–Hirschman index (HHI) of the uranium front end, by stage, with and without Russia and China.</w:t>
       </w:r>
       <w:r>
         <w:t xml:space="preserve"> </w:t>
@@ -6010,7 +6299,7 @@
         <w:pStyle w:val="FirstParagraph"/>
       </w:pPr>
       <w:r>
-        <w:t xml:space="preserve">The same reactor has a social licence at Darlington and none at Liddell. Safety data do not explain the difference; consent, benefit and trust do (Table T10).</w:t>
+        <w:t xml:space="preserve">The same reactor has a social licence at Darlington and none at Liddell. Safety data do not explain the difference; consent, benefit and trust do (Table T11).</w:t>
       </w:r>
     </w:p>
     <w:p>
@@ -6046,7 +6335,7 @@
         <w:t xml:space="preserve"> </w:t>
       </w:r>
       <w:r>
-        <w:t xml:space="preserve">At Darlington the CNSC found the duty to consult met (CNSC, 2025). In June 2026 the seven Williams Treaties First Nations agreed to lend C$700 m to the project, converting to equity once all four units are complete, guaranteed half each by federal and Ontario programmes (Williams Treaties First Nations et al., 2026). Two of the seven told the CNSC in 2023–24 that their concerns had not been addressed, so equity is a means of consent, not a substitute for it. Australia’s precedent is a waste site chosen top-down and set aside by the Federal Court for apprehended bias (</w:t>
+        <w:t xml:space="preserve">At Darlington the CNSC found the duty to consult met (CNSC, 2025). In June 2026 the seven Williams Treaties First Nations announced a C$700 m investment, a loan converting to equity once all four units are complete, backed by federal and Ontario loan guarantees of about C$715 m (Williams Treaties First Nations et al., 2026; Government of Canada, 2026). The first is the investment, the second its credit support. Two of the seven told the CNSC in 2023–24 that their concerns had not been addressed, so ownership by participating Nations is not universal consent, nor a substitute for consulting other Indigenous groups. Australia’s precedent is a waste site chosen top-down and set aside by the Federal Court for apprehended bias (</w:t>
       </w:r>
       <w:r>
         <w:rPr>
@@ -6077,7 +6366,7 @@
         <w:t xml:space="preserve"> </w:t>
       </w:r>
       <w:r>
-        <w:t xml:space="preserve">C1 changes no land use, emissions or waste, so it raises no new consent issue; its social value is indirect, as a lower-carbon build that OPG can report to its First Nations and public equity partners (our inference). For Liddell, low-regret steps can precede any repeal: a producer-funded waste body, and a two-key test in which both the host community and the Traditional Owners must agree. A priced hosting agreement, First Nations equity with a loan guarantee and a skills plan coordinated with AUKUS would follow (§8.6).</w:t>
+        <w:t xml:space="preserve">C1 changes no land use, emissions or waste at the site, so it raises no new consent issue there; its social value is indirect, as a lower-carbon build that OPG can report to its First Nations and public equity partners (our inference). Away from the site, clay sourcing, haulage and water use could create distributional impacts, and powder dust and calcination emissions are occupational matters at suppliers and batching plants. A socially sustainable pilot would disclose source locations and routes early, open supply to Indigenous and local firms where technically suitable, and report environmental data plainly. Waste stewardship is unchanged: the NWMO repository near Ignace entered regulatory assessment in January 2026 and is not operating (Nuclear Waste Management Organization, 2026), and LC³ has no proven recyclability or clearance advantage. For Liddell, low-regret steps can precede any repeal: a producer-funded waste body, and a two-key test in which both the host community and the Traditional Owners must agree. A priced hosting agreement, First Nations equity with a loan guarantee and a skills plan coordinated with AUKUS would follow (§8.6).</w:t>
       </w:r>
     </w:p>
     <w:p>
@@ -6089,7 +6378,7 @@
           <w:iCs/>
           <w:i/>
         </w:rPr>
-        <w:t xml:space="preserve">Table T10. Social licence at Darlington and at Liddell.</w:t>
+        <w:t xml:space="preserve">Table T11. Social licence at Darlington and at Liddell.</w:t>
       </w:r>
       <w:r>
         <w:t xml:space="preserve"> </w:t>
@@ -6480,7 +6769,7 @@
         <w:pStyle w:val="BodyText"/>
       </w:pPr>
       <w:r>
-        <w:t xml:space="preserve">Money follows the same pattern (Table T11). OPG carries about 78% of Darlington on its balance sheet (by subtraction; our calculation), recovered through rates the Ontario Energy Board approves, while federal, provincial and First Nations finance lowers the cost of capital and spreads ownership. That model needs a publicly owned utility with a regulated rate base. Liddell has a private owner, so it would need Commonwealth ownership or underwriting (§8.2), with taxpayers carrying the cost risk under the Coalition’s 2024 model, as reported by ABC News (2024).</w:t>
+        <w:t xml:space="preserve">Table T12 sets each actor’s influence and interest beside its money. OPG carries about 78% of Darlington on its balance sheet (by subtraction; our calculation), recovered through rates the Ontario Energy Board approves, while federal, provincial and First Nations finance lowers the cost of capital and spreads ownership. That model needs a publicly owned utility with a regulated rate base. Liddell has a private owner, so it would need Commonwealth ownership or underwriting (§8.2), with taxpayers carrying the cost risk under the Coalition’s 2024 model, as reported by ABC News (2024).</w:t>
       </w:r>
     </w:p>
     <w:p>
@@ -6488,7 +6777,7 @@
         <w:pStyle w:val="BodyText"/>
       </w:pPr>
       <w:r>
-        <w:t xml:space="preserve">For C1, the decisive actors are OPG as buyer, GE Vernova Hitachi as owner of the infill specification, and the two equity funds at the Units 2–4 tranche (§8.2). None is opposed, but none yet has a reason to act; the tranche condition supplies one (§8.6).</w:t>
+        <w:t xml:space="preserve">For C1, the decisive actors are OPG as buyer, GE Vernova Hitachi as owner of the infill specification, and the two equity funds at the Units 2–4 tranche (§8.2). None is opposed, but none yet has a reason to act; the tranche condition supplies one (§8.6). Contractors and suppliers then decide whether LC³ is deliverable.</w:t>
       </w:r>
     </w:p>
     <w:p>
@@ -6555,7 +6844,7 @@
           <w:iCs/>
           <w:i/>
         </w:rPr>
-        <w:t xml:space="preserve">Table T11. Who pays and who earns: the C$20.9 bn Darlington New Nuclear Project.</w:t>
+        <w:t xml:space="preserve">Table T12. Stakeholders at the C$20.9 bn Darlington New Nuclear Project: influence, interest in C1, and money.</w:t>
       </w:r>
       <w:r>
         <w:t xml:space="preserve"> </w:t>
@@ -6565,7 +6854,7 @@
           <w:iCs/>
           <w:i/>
         </w:rPr>
-        <w:t xml:space="preserve">Source: as cited in each row; shares calculated in Appendix B8.4.</w:t>
+        <w:t xml:space="preserve">Source: influence ratings and interests are our qualitative judgement, not survey data; money as cited in each row; shares calculated in Appendix B8.4.</w:t>
       </w:r>
     </w:p>
     <w:tbl>
@@ -6593,243 +6882,443 @@
               <w:jc w:val="left"/>
             </w:pPr>
             <w:r>
-              <w:t xml:space="preserve">Flow</w:t>
-            </w:r>
-          </w:p>
-        </w:tc>
-        <w:tc>
-          <w:tcPr/>
-          <w:p>
-            <w:pPr>
-              <w:pStyle w:val="Compact"/>
-              <w:jc w:val="left"/>
-            </w:pPr>
-            <w:r>
-              <w:t xml:space="preserve">Who pays</w:t>
-            </w:r>
-          </w:p>
-        </w:tc>
-        <w:tc>
-          <w:tcPr/>
-          <w:p>
-            <w:pPr>
-              <w:pStyle w:val="Compact"/>
-              <w:jc w:val="left"/>
-            </w:pPr>
-            <w:r>
-              <w:t xml:space="preserve">Who earns</w:t>
-            </w:r>
-          </w:p>
-        </w:tc>
-        <w:tc>
-          <w:tcPr/>
-          <w:p>
-            <w:pPr>
-              <w:pStyle w:val="Compact"/>
-              <w:jc w:val="left"/>
-            </w:pPr>
-            <w:r>
-              <w:t xml:space="preserve">Amount (share)</w:t>
-            </w:r>
-          </w:p>
-        </w:tc>
-      </w:tr>
-      <w:tr>
-        <w:tc>
-          <w:tcPr/>
-          <w:p>
-            <w:pPr>
-              <w:pStyle w:val="Compact"/>
-              <w:jc w:val="left"/>
-            </w:pPr>
-            <w:r>
-              <w:t xml:space="preserve">OPG’s share, recovered through Ontario Energy Board-approved rates</w:t>
-            </w:r>
-          </w:p>
-        </w:tc>
-        <w:tc>
-          <w:tcPr/>
-          <w:p>
-            <w:pPr>
-              <w:pStyle w:val="Compact"/>
-              <w:jc w:val="left"/>
-            </w:pPr>
-            <w:r>
-              <w:t xml:space="preserve">OPG, repaid by Ontario ratepayers (Ontario Power Generation, 2025b)</w:t>
-            </w:r>
-          </w:p>
-        </w:tc>
-        <w:tc>
-          <w:tcPr/>
-          <w:p>
-            <w:pPr>
-              <w:pStyle w:val="Compact"/>
-              <w:jc w:val="left"/>
-            </w:pPr>
-            <w:r>
-              <w:t xml:space="preserve">GE Vernova Hitachi, construction partners, suppliers</w:t>
-            </w:r>
-          </w:p>
-        </w:tc>
-        <w:tc>
-          <w:tcPr/>
-          <w:p>
-            <w:pPr>
-              <w:pStyle w:val="Compact"/>
-              <w:jc w:val="left"/>
-            </w:pPr>
-            <w:r>
-              <w:t xml:space="preserve">C$16.2 bn (78%)</w:t>
-            </w:r>
-          </w:p>
-        </w:tc>
-      </w:tr>
-      <w:tr>
-        <w:tc>
-          <w:tcPr/>
-          <w:p>
-            <w:pPr>
-              <w:pStyle w:val="Compact"/>
-              <w:jc w:val="left"/>
-            </w:pPr>
-            <w:r>
-              <w:t xml:space="preserve">Phase 1 loan</w:t>
-            </w:r>
-          </w:p>
-        </w:tc>
-        <w:tc>
-          <w:tcPr/>
-          <w:p>
-            <w:pPr>
-              <w:pStyle w:val="Compact"/>
-              <w:jc w:val="left"/>
-            </w:pPr>
-            <w:r>
-              <w:t xml:space="preserve">Canada Infrastructure Bank (2022)</w:t>
-            </w:r>
-          </w:p>
-        </w:tc>
-        <w:tc>
-          <w:tcPr/>
-          <w:p>
-            <w:pPr>
-              <w:pStyle w:val="Compact"/>
-              <w:jc w:val="left"/>
-            </w:pPr>
-            <w:r>
-              <w:t xml:space="preserve">The project; the bank earns interest</w:t>
-            </w:r>
-          </w:p>
-        </w:tc>
-        <w:tc>
-          <w:tcPr/>
-          <w:p>
-            <w:pPr>
-              <w:pStyle w:val="Compact"/>
-              <w:jc w:val="left"/>
-            </w:pPr>
-            <w:r>
-              <w:t xml:space="preserve">C$0.97 bn (4.6%)</w:t>
-            </w:r>
-          </w:p>
-        </w:tc>
-      </w:tr>
-      <w:tr>
-        <w:tc>
-          <w:tcPr/>
-          <w:p>
-            <w:pPr>
-              <w:pStyle w:val="Compact"/>
-              <w:jc w:val="left"/>
-            </w:pPr>
-            <w:r>
-              <w:t xml:space="preserve">Equity in two tranches</w:t>
-            </w:r>
-          </w:p>
-        </w:tc>
-        <w:tc>
-          <w:tcPr/>
-          <w:p>
-            <w:pPr>
-              <w:pStyle w:val="Compact"/>
-              <w:jc w:val="left"/>
-            </w:pPr>
-            <w:r>
-              <w:t xml:space="preserve">Canada Growth Fund and Building Ontario Fund (2025)</w:t>
-            </w:r>
-          </w:p>
-        </w:tc>
-        <w:tc>
-          <w:tcPr/>
-          <w:p>
-            <w:pPr>
-              <w:pStyle w:val="Compact"/>
-              <w:jc w:val="left"/>
-            </w:pPr>
-            <w:r>
-              <w:t xml:space="preserve">Returns on stakes of up to 15% and 7.5%</w:t>
-            </w:r>
-          </w:p>
-        </w:tc>
-        <w:tc>
-          <w:tcPr/>
-          <w:p>
-            <w:pPr>
-              <w:pStyle w:val="Compact"/>
-              <w:jc w:val="left"/>
-            </w:pPr>
-            <w:r>
-              <w:t xml:space="preserve">C$3.0 bn (14.4%)</w:t>
-            </w:r>
-          </w:p>
-        </w:tc>
-      </w:tr>
-      <w:tr>
-        <w:tc>
-          <w:tcPr/>
-          <w:p>
-            <w:pPr>
-              <w:pStyle w:val="Compact"/>
-              <w:jc w:val="left"/>
-            </w:pPr>
-            <w:r>
-              <w:t xml:space="preserve">Loan converting to equity</w:t>
-            </w:r>
-          </w:p>
-        </w:tc>
-        <w:tc>
-          <w:tcPr/>
-          <w:p>
-            <w:pPr>
-              <w:pStyle w:val="Compact"/>
-              <w:jc w:val="left"/>
-            </w:pPr>
-            <w:r>
-              <w:t xml:space="preserve">Williams Treaties First Nations; guarantors carry default risk (Williams Treaties First Nations et al., 2026)</w:t>
-            </w:r>
-          </w:p>
-        </w:tc>
-        <w:tc>
-          <w:tcPr/>
-          <w:p>
-            <w:pPr>
-              <w:pStyle w:val="Compact"/>
-              <w:jc w:val="left"/>
-            </w:pPr>
-            <w:r>
-              <w:t xml:space="preserve">First Nations equity returns</w:t>
-            </w:r>
-          </w:p>
-        </w:tc>
-        <w:tc>
-          <w:tcPr/>
-          <w:p>
-            <w:pPr>
-              <w:pStyle w:val="Compact"/>
-              <w:jc w:val="left"/>
-            </w:pPr>
-            <w:r>
-              <w:t xml:space="preserve">C$0.70 bn (3.3%)</w:t>
+              <w:t xml:space="preserve">Stakeholder</w:t>
+            </w:r>
+          </w:p>
+        </w:tc>
+        <w:tc>
+          <w:tcPr/>
+          <w:p>
+            <w:pPr>
+              <w:pStyle w:val="Compact"/>
+              <w:jc w:val="left"/>
+            </w:pPr>
+            <w:r>
+              <w:t xml:space="preserve">Influence</w:t>
+            </w:r>
+          </w:p>
+        </w:tc>
+        <w:tc>
+          <w:tcPr/>
+          <w:p>
+            <w:pPr>
+              <w:pStyle w:val="Compact"/>
+              <w:jc w:val="left"/>
+            </w:pPr>
+            <w:r>
+              <w:t xml:space="preserve">Primary interest and suitable response for C1</w:t>
+            </w:r>
+          </w:p>
+        </w:tc>
+        <w:tc>
+          <w:tcPr/>
+          <w:p>
+            <w:pPr>
+              <w:pStyle w:val="Compact"/>
+              <w:jc w:val="left"/>
+            </w:pPr>
+            <w:r>
+              <w:t xml:space="preserve">Money (share of budget)</w:t>
+            </w:r>
+          </w:p>
+        </w:tc>
+      </w:tr>
+      <w:tr>
+        <w:tc>
+          <w:tcPr/>
+          <w:p>
+            <w:pPr>
+              <w:pStyle w:val="Compact"/>
+              <w:jc w:val="left"/>
+            </w:pPr>
+            <w:r>
+              <w:t xml:space="preserve">OPG and its design authority</w:t>
+            </w:r>
+          </w:p>
+        </w:tc>
+        <w:tc>
+          <w:tcPr/>
+          <w:p>
+            <w:pPr>
+              <w:pStyle w:val="Compact"/>
+              <w:jc w:val="left"/>
+            </w:pPr>
+            <w:r>
+              <w:t xml:space="preserve">Very high</w:t>
+            </w:r>
+          </w:p>
+        </w:tc>
+        <w:tc>
+          <w:tcPr/>
+          <w:p>
+            <w:pPr>
+              <w:pStyle w:val="Compact"/>
+              <w:jc w:val="left"/>
+            </w:pPr>
+            <w:r>
+              <w:t xml:space="preserve">Safety, eligible concrete scope, budgets, delivery; oversee qualification and a fallback mix</w:t>
+            </w:r>
+          </w:p>
+        </w:tc>
+        <w:tc>
+          <w:tcPr/>
+          <w:p>
+            <w:pPr>
+              <w:pStyle w:val="Compact"/>
+              <w:jc w:val="left"/>
+            </w:pPr>
+            <w:r>
+              <w:t xml:space="preserve">Pays C$16.2 bn (78%), repaid by Ontario ratepayers through Ontario Energy Board-approved rates (Ontario Power Generation, 2025b)</w:t>
+            </w:r>
+          </w:p>
+        </w:tc>
+      </w:tr>
+      <w:tr>
+        <w:tc>
+          <w:tcPr/>
+          <w:p>
+            <w:pPr>
+              <w:pStyle w:val="Compact"/>
+              <w:jc w:val="left"/>
+            </w:pPr>
+            <w:r>
+              <w:t xml:space="preserve">CNSC</w:t>
+            </w:r>
+          </w:p>
+        </w:tc>
+        <w:tc>
+          <w:tcPr/>
+          <w:p>
+            <w:pPr>
+              <w:pStyle w:val="Compact"/>
+              <w:jc w:val="left"/>
+            </w:pPr>
+            <w:r>
+              <w:t xml:space="preserve">Very high</w:t>
+            </w:r>
+          </w:p>
+        </w:tc>
+        <w:tc>
+          <w:tcPr/>
+          <w:p>
+            <w:pPr>
+              <w:pStyle w:val="Compact"/>
+              <w:jc w:val="left"/>
+            </w:pPr>
+            <w:r>
+              <w:t xml:space="preserve">Independent compliance and safety case; evaluate material changes where applicable</w:t>
+            </w:r>
+          </w:p>
+        </w:tc>
+        <w:tc>
+          <w:tcPr/>
+          <w:p>
+            <w:pPr>
+              <w:pStyle w:val="Compact"/>
+              <w:jc w:val="left"/>
+            </w:pPr>
+            <w:r>
+              <w:t xml:space="preserve">None</w:t>
+            </w:r>
+          </w:p>
+        </w:tc>
+      </w:tr>
+      <w:tr>
+        <w:tc>
+          <w:tcPr/>
+          <w:p>
+            <w:pPr>
+              <w:pStyle w:val="Compact"/>
+              <w:jc w:val="left"/>
+            </w:pPr>
+            <w:r>
+              <w:t xml:space="preserve">Williams Treaties First Nations and other rights holders</w:t>
+            </w:r>
+          </w:p>
+        </w:tc>
+        <w:tc>
+          <w:tcPr/>
+          <w:p>
+            <w:pPr>
+              <w:pStyle w:val="Compact"/>
+              <w:jc w:val="left"/>
+            </w:pPr>
+            <w:r>
+              <w:t xml:space="preserve">High</w:t>
+            </w:r>
+          </w:p>
+        </w:tc>
+        <w:tc>
+          <w:tcPr/>
+          <w:p>
+            <w:pPr>
+              <w:pStyle w:val="Compact"/>
+              <w:jc w:val="left"/>
+            </w:pPr>
+            <w:r>
+              <w:t xml:space="preserve">Long-term participation, cultural and environmental interests; rights-respecting engagement</w:t>
+            </w:r>
+          </w:p>
+        </w:tc>
+        <w:tc>
+          <w:tcPr/>
+          <w:p>
+            <w:pPr>
+              <w:pStyle w:val="Compact"/>
+              <w:jc w:val="left"/>
+            </w:pPr>
+            <w:r>
+              <w:t xml:space="preserve">Loan converting to equity, C$0.70 bn (3.3%); guarantors carry default risk (Williams Treaties First Nations et al., 2026)</w:t>
+            </w:r>
+          </w:p>
+        </w:tc>
+      </w:tr>
+      <w:tr>
+        <w:tc>
+          <w:tcPr/>
+          <w:p>
+            <w:pPr>
+              <w:pStyle w:val="Compact"/>
+              <w:jc w:val="left"/>
+            </w:pPr>
+            <w:r>
+              <w:t xml:space="preserve">Public financiers and investors</w:t>
+            </w:r>
+          </w:p>
+        </w:tc>
+        <w:tc>
+          <w:tcPr/>
+          <w:p>
+            <w:pPr>
+              <w:pStyle w:val="Compact"/>
+              <w:jc w:val="left"/>
+            </w:pPr>
+            <w:r>
+              <w:t xml:space="preserve">High</w:t>
+            </w:r>
+          </w:p>
+        </w:tc>
+        <w:tc>
+          <w:tcPr/>
+          <w:p>
+            <w:pPr>
+              <w:pStyle w:val="Compact"/>
+              <w:jc w:val="left"/>
+            </w:pPr>
+            <w:r>
+              <w:t xml:space="preserve">Investment risk, delivery milestones, lower-carbon economic development</w:t>
+            </w:r>
+          </w:p>
+        </w:tc>
+        <w:tc>
+          <w:tcPr/>
+          <w:p>
+            <w:pPr>
+              <w:pStyle w:val="Compact"/>
+              <w:jc w:val="left"/>
+            </w:pPr>
+            <w:r>
+              <w:t xml:space="preserve">Canada Infrastructure Bank Phase 1 loan, C$0.97 bn (4.6%) (Canada Infrastructure Bank, 2022); equity in two tranches, C$3.0 bn (14.4%), for stakes of up to 15% and 7.5% (Canada Growth Fund and Building Ontario Fund, 2025)</w:t>
+            </w:r>
+          </w:p>
+        </w:tc>
+      </w:tr>
+      <w:tr>
+        <w:tc>
+          <w:tcPr/>
+          <w:p>
+            <w:pPr>
+              <w:pStyle w:val="Compact"/>
+              <w:jc w:val="left"/>
+            </w:pPr>
+            <w:r>
+              <w:t xml:space="preserve">Contractors, ready-mix and clay suppliers</w:t>
+            </w:r>
+          </w:p>
+        </w:tc>
+        <w:tc>
+          <w:tcPr/>
+          <w:p>
+            <w:pPr>
+              <w:pStyle w:val="Compact"/>
+              <w:jc w:val="left"/>
+            </w:pPr>
+            <w:r>
+              <w:t xml:space="preserve">High</w:t>
+            </w:r>
+          </w:p>
+        </w:tc>
+        <w:tc>
+          <w:tcPr/>
+          <w:p>
+            <w:pPr>
+              <w:pStyle w:val="Compact"/>
+              <w:jc w:val="left"/>
+            </w:pPr>
+            <w:r>
+              <w:t xml:space="preserve">Constructability, price, traceability, warranties, continuous quality testing</w:t>
+            </w:r>
+          </w:p>
+        </w:tc>
+        <w:tc>
+          <w:tcPr/>
+          <w:p>
+            <w:pPr>
+              <w:pStyle w:val="Compact"/>
+              <w:jc w:val="left"/>
+            </w:pPr>
+            <w:r>
+              <w:t xml:space="preserve">Earn the construction revenue, with GE Vernova Hitachi</w:t>
+            </w:r>
+          </w:p>
+        </w:tc>
+      </w:tr>
+      <w:tr>
+        <w:tc>
+          <w:tcPr/>
+          <w:p>
+            <w:pPr>
+              <w:pStyle w:val="Compact"/>
+              <w:jc w:val="left"/>
+            </w:pPr>
+            <w:r>
+              <w:t xml:space="preserve">Clarington residents and electricity customers</w:t>
+            </w:r>
+          </w:p>
+        </w:tc>
+        <w:tc>
+          <w:tcPr/>
+          <w:p>
+            <w:pPr>
+              <w:pStyle w:val="Compact"/>
+              <w:jc w:val="left"/>
+            </w:pPr>
+            <w:r>
+              <w:t xml:space="preserve">Medium–high</w:t>
+            </w:r>
+          </w:p>
+        </w:tc>
+        <w:tc>
+          <w:tcPr/>
+          <w:p>
+            <w:pPr>
+              <w:pStyle w:val="Compact"/>
+              <w:jc w:val="left"/>
+            </w:pPr>
+            <w:r>
+              <w:t xml:space="preserve">Air and water impacts, transparent reporting, cost and reliability</w:t>
+            </w:r>
+          </w:p>
+        </w:tc>
+        <w:tc>
+          <w:tcPr/>
+          <w:p>
+            <w:pPr>
+              <w:pStyle w:val="Compact"/>
+              <w:jc w:val="left"/>
+            </w:pPr>
+            <w:r>
+              <w:t xml:space="preserve">Repay OPG’s share through rates</w:t>
+            </w:r>
+          </w:p>
+        </w:tc>
+      </w:tr>
+      <w:tr>
+        <w:tc>
+          <w:tcPr/>
+          <w:p>
+            <w:pPr>
+              <w:pStyle w:val="Compact"/>
+              <w:jc w:val="left"/>
+            </w:pPr>
+            <w:r>
+              <w:t xml:space="preserve">Workers, unions and laboratories</w:t>
+            </w:r>
+          </w:p>
+        </w:tc>
+        <w:tc>
+          <w:tcPr/>
+          <w:p>
+            <w:pPr>
+              <w:pStyle w:val="Compact"/>
+              <w:jc w:val="left"/>
+            </w:pPr>
+            <w:r>
+              <w:t xml:space="preserve">Medium–high</w:t>
+            </w:r>
+          </w:p>
+        </w:tc>
+        <w:tc>
+          <w:tcPr/>
+          <w:p>
+            <w:pPr>
+              <w:pStyle w:val="Compact"/>
+              <w:jc w:val="left"/>
+            </w:pPr>
+            <w:r>
+              <w:t xml:space="preserve">Occupational safety, training, testing, reliable construction procedures</w:t>
+            </w:r>
+          </w:p>
+        </w:tc>
+        <w:tc>
+          <w:tcPr/>
+          <w:p>
+            <w:pPr>
+              <w:pStyle w:val="Compact"/>
+              <w:jc w:val="left"/>
+            </w:pPr>
+            <w:r>
+              <w:t xml:space="preserve">About 1,600 construction jobs per SMR (§8.4)</w:t>
+            </w:r>
+          </w:p>
+        </w:tc>
+      </w:tr>
+      <w:tr>
+        <w:tc>
+          <w:tcPr/>
+          <w:p>
+            <w:pPr>
+              <w:pStyle w:val="Compact"/>
+              <w:jc w:val="left"/>
+            </w:pPr>
+            <w:r>
+              <w:t xml:space="preserve">NWMO and waste managers</w:t>
+            </w:r>
+          </w:p>
+        </w:tc>
+        <w:tc>
+          <w:tcPr/>
+          <w:p>
+            <w:pPr>
+              <w:pStyle w:val="Compact"/>
+              <w:jc w:val="left"/>
+            </w:pPr>
+            <w:r>
+              <w:t xml:space="preserve">Medium</w:t>
+            </w:r>
+          </w:p>
+        </w:tc>
+        <w:tc>
+          <w:tcPr/>
+          <w:p>
+            <w:pPr>
+              <w:pStyle w:val="Compact"/>
+              <w:jc w:val="left"/>
+            </w:pPr>
+            <w:r>
+              <w:t xml:space="preserve">Long-term waste stewardship; funded end-of-life obligations</w:t>
+            </w:r>
+          </w:p>
+        </w:tc>
+        <w:tc>
+          <w:tcPr/>
+          <w:p>
+            <w:pPr>
+              <w:pStyle w:val="Compact"/>
+              <w:jc w:val="left"/>
+            </w:pPr>
+            <w:r>
+              <w:t xml:space="preserve">Producer-funded (§8.4)</w:t>
             </w:r>
           </w:p>
         </w:tc>
@@ -6867,7 +7356,7 @@
         <w:t xml:space="preserve"> </w:t>
       </w:r>
       <w:r>
-        <w:t xml:space="preserve">The levers in Table T12 are scored on enforceability, speed and low schedule risk (1 to 3 each; our judgement, not sourced scores). L1 and L2 tie at 8. If enforceability counts double, L2 leads with 11; if speed counts double, L1 leads with 11; the recommendation is the same under both. L1 is C1’s pilot step, not an add-on: a 10% floor invites LC³, whose full saving is 1,100–3,300 t CO₂e per unit (§4.3; Pillai et al., 2019).</w:t>
+        <w:t xml:space="preserve">The levers in Table T13 are scored on enforceability, speed and low schedule risk (1 to 3 each; our judgement, not sourced scores). L1 and L2 tie at 8. If enforceability counts double, L2 leads with 11; if speed counts double, L1 leads with 11; the recommendation is the same under both. L1 is C1’s pilot step, not an add-on: a 10% floor invites LC³, whose full saving is 1,100–3,300 t CO₂e per unit (§4.3; Pillai et al., 2019).</w:t>
       </w:r>
     </w:p>
     <w:p>
@@ -6879,7 +7368,7 @@
           <w:iCs/>
           <w:i/>
         </w:rPr>
-        <w:t xml:space="preserve">Table T12. Levers for putting C1 into practice, compared.</w:t>
+        <w:t xml:space="preserve">Table T13. Levers for putting C1 into practice, compared.</w:t>
       </w:r>
       <w:r>
         <w:t xml:space="preserve"> </w:t>
@@ -6889,7 +7378,7 @@
           <w:iCs/>
           <w:i/>
         </w:rPr>
-        <w:t xml:space="preserve">Source: our evaluation from Treasury Board of Canada Secretariat (2022); Canada Growth Fund and Building Ontario Fund (2025). Scores are our judgement (Appendix B3.1).</w:t>
+        <w:t xml:space="preserve">Source: our evaluation from Treasury Board of Canada Secretariat (2022); Canada Growth Fund and Building Ontario Fund (2025). Scores are our judgement (Appendix B3.1). The qualification gates adapt the team’s table of regulatory and engineering conditions for alternative concrete.</w:t>
       </w:r>
     </w:p>
     <w:tbl>
@@ -6943,19 +7432,7 @@
               <w:jc w:val="left"/>
             </w:pPr>
             <w:r>
-              <w:t xml:space="preserve">Binding on OPG?</w:t>
-            </w:r>
-          </w:p>
-        </w:tc>
-        <w:tc>
-          <w:tcPr/>
-          <w:p>
-            <w:pPr>
-              <w:pStyle w:val="Compact"/>
-              <w:jc w:val="left"/>
-            </w:pPr>
-            <w:r>
-              <w:t xml:space="preserve">Time</w:t>
+              <w:t xml:space="preserve">Binding on OPG? When</w:t>
             </w:r>
           </w:p>
         </w:tc>
@@ -6979,6 +7456,18 @@
               <w:jc w:val="left"/>
             </w:pPr>
             <w:r>
+              <w:t xml:space="preserve">Qualification gate it depends on; outcome if not met</w:t>
+            </w:r>
+          </w:p>
+        </w:tc>
+        <w:tc>
+          <w:tcPr/>
+          <w:p>
+            <w:pPr>
+              <w:pStyle w:val="Compact"/>
+              <w:jc w:val="left"/>
+            </w:pPr>
+            <w:r>
               <w:t xml:space="preserve">Score (enforceability / speed / low risk)</w:t>
             </w:r>
           </w:p>
@@ -7017,19 +7506,7 @@
               <w:jc w:val="left"/>
             </w:pPr>
             <w:r>
-              <w:t xml:space="preserve">Yes (own contracts)</w:t>
-            </w:r>
-          </w:p>
-        </w:tc>
-        <w:tc>
-          <w:tcPr/>
-          <w:p>
-            <w:pPr>
-              <w:pStyle w:val="Compact"/>
-              <w:jc w:val="left"/>
-            </w:pPr>
-            <w:r>
-              <w:t xml:space="preserve">Next procurement round (2027)</w:t>
+              <w:t xml:space="preserve">Yes (own contracts); next procurement round (2027)</w:t>
             </w:r>
           </w:p>
         </w:tc>
@@ -7042,6 +7519,18 @@
             </w:pPr>
             <w:r>
               <w:t xml:space="preserve">Low</w:t>
+            </w:r>
+          </w:p>
+        </w:tc>
+        <w:tc>
+          <w:tcPr/>
+          <w:p>
+            <w:pPr>
+              <w:pStyle w:val="Compact"/>
+              <w:jc w:val="left"/>
+            </w:pPr>
+            <w:r>
+              <w:t xml:space="preserve">Classification and provenance: each component’s safety function defined, binder traced; if not, exclude it and revert to the approved mix</w:t>
             </w:r>
           </w:p>
         </w:tc>
@@ -7101,19 +7590,7 @@
               <w:jc w:val="left"/>
             </w:pPr>
             <w:r>
-              <w:t xml:space="preserve">Yes, if the funds agree</w:t>
-            </w:r>
-          </w:p>
-        </w:tc>
-        <w:tc>
-          <w:tcPr/>
-          <w:p>
-            <w:pPr>
-              <w:pStyle w:val="Compact"/>
-              <w:jc w:val="left"/>
-            </w:pPr>
-            <w:r>
-              <w:t xml:space="preserve">With tranche 2 (around 2028)</w:t>
+              <w:t xml:space="preserve">Yes, if the funds agree; with tranche 2 (around 2028)</w:t>
             </w:r>
           </w:p>
         </w:tc>
@@ -7126,6 +7603,18 @@
             </w:pPr>
             <w:r>
               <w:t xml:space="preserve">Low, if the exemption is written in</w:t>
+            </w:r>
+          </w:p>
+        </w:tc>
+        <w:tc>
+          <w:tcPr/>
+          <w:p>
+            <w:pPr>
+              <w:pStyle w:val="Compact"/>
+              <w:jc w:val="left"/>
+            </w:pPr>
+            <w:r>
+              <w:t xml:space="preserve">Life-cycle verification: EPDs on a comparable product boundary, with transport modelled; if not, no quantified saving claim</w:t>
             </w:r>
           </w:p>
         </w:tc>
@@ -7185,19 +7674,7 @@
               <w:jc w:val="left"/>
             </w:pPr>
             <w:r>
-              <w:t xml:space="preserve">Yes</w:t>
-            </w:r>
-          </w:p>
-        </w:tc>
-        <w:tc>
-          <w:tcPr/>
-          <w:p>
-            <w:pPr>
-              <w:pStyle w:val="Compact"/>
-              <w:jc w:val="left"/>
-            </w:pPr>
-            <w:r>
-              <w:t xml:space="preserve">Months</w:t>
+              <w:t xml:space="preserve">Yes; months</w:t>
             </w:r>
           </w:p>
         </w:tc>
@@ -7221,6 +7698,18 @@
               <w:jc w:val="left"/>
             </w:pPr>
             <w:r>
+              <w:t xml:space="preserve">Design-authority acceptance, with CNSC review where relevant; if not, no use in affected safety-class works</w:t>
+            </w:r>
+          </w:p>
+        </w:tc>
+        <w:tc>
+          <w:tcPr/>
+          <w:p>
+            <w:pPr>
+              <w:pStyle w:val="Compact"/>
+              <w:jc w:val="left"/>
+            </w:pPr>
+            <w:r>
               <w:t xml:space="preserve">3 / 2 / 2 = 7</w:t>
             </w:r>
           </w:p>
@@ -7259,19 +7748,7 @@
               <w:jc w:val="left"/>
             </w:pPr>
             <w:r>
-              <w:t xml:space="preserve">No</w:t>
-            </w:r>
-          </w:p>
-        </w:tc>
-        <w:tc>
-          <w:tcPr/>
-          <w:p>
-            <w:pPr>
-              <w:pStyle w:val="Compact"/>
-              <w:jc w:val="left"/>
-            </w:pPr>
-            <w:r>
-              <w:t xml:space="preserve">2027</w:t>
+              <w:t xml:space="preserve">No; 2027</w:t>
             </w:r>
           </w:p>
         </w:tc>
@@ -7284,6 +7761,18 @@
             </w:pPr>
             <w:r>
               <w:t xml:space="preserve">Removes the main schedule risk</w:t>
+            </w:r>
+          </w:p>
+        </w:tc>
+        <w:tc>
+          <w:tcPr/>
+          <w:p>
+            <w:pPr>
+              <w:pStyle w:val="Compact"/>
+              <w:jc w:val="left"/>
+            </w:pPr>
+            <w:r>
+              <w:t xml:space="preserve">Strength, heat, crack and durability data, lot records and mock-ups; if not met, a further trial, rework or rejection</w:t>
             </w:r>
           </w:p>
         </w:tc>
@@ -7316,7 +7805,7 @@
         <w:t xml:space="preserve"> </w:t>
       </w:r>
       <w:r>
-        <w:t xml:space="preserve">The sequence is L1 now, L4 in 2027, then L2 at the 2028 tranche. A CNSC licence condition is not a lever, because the CNSC does not set climate conditions; it only has to accept that the change is safe (our inference). Step 1, in 2027, develops slag and LC³ self-consolidating mixes (about 6 to 9 months). Step 2 is a full-scale mock-up trial off Unit 1’s critical path (about 6 months), funded by L4. Step 3 is the design-change evaluation, submitted with the Units 2–4 licensing package ahead of the approval expected in 2028, as reported (American Nuclear Society, 2026); it takes about 6 to 9 months (assumed). The steps total about 18 to 24 months (assumed), so they fit only if they start in 2027. We have not costed the programme; §9 tests an assumed C$1 m. If the evidence is not ready, Units 2–4 proceed with the current mix, the pilot continues in non-safety concrete, and the infill enters at a later unit. Doing nothing forgoes the saving at near-zero cost and is rejected.</w:t>
+        <w:t xml:space="preserve">The sequence is L1 now, L4 in 2027, then L2 at the 2028 tranche. A CNSC licence condition is not a lever, because the CNSC does not set climate conditions; it only has to accept that the change is safe (our inference). Oversight continues after approval, through batch testing, record retention, non-conformance procedures and inspection access, and the approved mix stays available throughout. Step 1, in 2027, develops slag and LC³ self-consolidating mixes (about 6 to 9 months). Step 2 is a full-scale mock-up trial off Unit 1’s critical path (about 6 months), funded by L4. Step 3 is the design-change evaluation, submitted with the Units 2–4 licensing package ahead of the approval expected in 2028, as reported (American Nuclear Society, 2026); it takes about 6 to 9 months (assumed). The steps total about 18 to 24 months (assumed), so they fit only if they start in 2027. We have not costed the programme; §9 tests an assumed C$1 m. If the evidence is not ready, Units 2–4 proceed with the current mix, the pilot continues in non-safety concrete, and the infill enters at a later unit. Doing nothing forgoes the saving at near-zero cost and is rejected.</w:t>
       </w:r>
     </w:p>
     <w:p>
@@ -7334,7 +7823,7 @@
         <w:t xml:space="preserve"> </w:t>
       </w:r>
       <w:r>
-        <w:t xml:space="preserve">The Standard on Embodied Carbon in Construction binds federal departments (Treasury Board of Canada Secretariat, 2022); OPG, an Ontario Crown corporation, is outside its scope (our inference). Its allowance of 130% of baseline for specialised mixes could let self-consolidating infill emit 30% more than the baseline, so any OPG or fund clause must benchmark infill against a cement-rich self-consolidating reference mix.</w:t>
+        <w:t xml:space="preserve">The Standard on Embodied Carbon in Construction (amended March 2025) requires low-carbon concrete, life-cycle assessment and structural-material reporting in federal procurement (Treasury Board of Canada Secretariat, 2022). It is a model of transparency, but it binds federal departments, and OPG, an Ontario Crown corporation, is outside its scope (our inference); the Darlington choice rests on its own contracts, codes and licence conditions. Its allowance of 130% of baseline for specialised mixes could let self-consolidating infill emit 30% more than the baseline, so any OPG or fund clause must benchmark infill against a cement-rich self-consolidating reference mix.</w:t>
       </w:r>
     </w:p>
     <w:p>
@@ -7387,7 +7876,7 @@
         <w:pStyle w:val="FirstParagraph"/>
       </w:pPr>
       <w:r>
-        <w:t xml:space="preserve">Table T13 applies the triple bottom line to C1 at Darlington and to the comparison at Liddell, each cell traced to its section.</w:t>
+        <w:t xml:space="preserve">Table T14 applies the triple bottom line to C1 at Darlington and to the comparison at Liddell, each cell traced to its section.</w:t>
       </w:r>
     </w:p>
     <w:p>
@@ -7399,7 +7888,7 @@
           <w:iCs/>
           <w:i/>
         </w:rPr>
-        <w:t xml:space="preserve">Table T13. Triple-bottom-line summary: C1 at Darlington Units 2–4 and one BWRX-300 at Liddell.</w:t>
+        <w:t xml:space="preserve">Table T14. Triple-bottom-line summary: C1 at Darlington Units 2–4 and one BWRX-300 at Liddell.</w:t>
       </w:r>
       <w:r>
         <w:t xml:space="preserve"> </w:t>
@@ -7410,325 +7899,6 @@
           <w:i/>
         </w:rPr>
         <w:t xml:space="preserve">Source: this study, from the sections cited.</w:t>
-      </w:r>
-    </w:p>
-    <w:tbl>
-      <w:tblPr>
-        <w:tblStyle w:val="Table"/>
-        <w:tblW w:type="auto" w:w="0"/>
-        <w:tblLook w:firstRow="1" w:lastRow="0" w:firstColumn="0" w:lastColumn="0" w:noHBand="0" w:noVBand="0" w:val="0020"/>
-        <w:jc w:val="start"/>
-      </w:tblPr>
-      <w:tblGrid>
-        <w:gridCol w:w="1980"/>
-        <w:gridCol w:w="1980"/>
-        <w:gridCol w:w="1980"/>
-        <w:gridCol w:w="1980"/>
-      </w:tblGrid>
-      <w:tr>
-        <w:trPr>
-          <w:tblHeader w:val="true"/>
-        </w:trPr>
-        <w:tc>
-          <w:tcPr/>
-          <w:p>
-            <w:pPr>
-              <w:pStyle w:val="Compact"/>
-            </w:pPr>
-          </w:p>
-        </w:tc>
-        <w:tc>
-          <w:tcPr/>
-          <w:p>
-            <w:pPr>
-              <w:pStyle w:val="Compact"/>
-              <w:jc w:val="left"/>
-            </w:pPr>
-            <w:r>
-              <w:t xml:space="preserve">Darlington, with C1</w:t>
-            </w:r>
-          </w:p>
-        </w:tc>
-        <w:tc>
-          <w:tcPr/>
-          <w:p>
-            <w:pPr>
-              <w:pStyle w:val="Compact"/>
-              <w:jc w:val="left"/>
-            </w:pPr>
-            <w:r>
-              <w:t xml:space="preserve">Liddell (one unit)</w:t>
-            </w:r>
-          </w:p>
-        </w:tc>
-        <w:tc>
-          <w:tcPr/>
-          <w:p>
-            <w:pPr>
-              <w:pStyle w:val="Compact"/>
-              <w:jc w:val="left"/>
-            </w:pPr>
-            <w:r>
-              <w:t xml:space="preserve">Traced to</w:t>
-            </w:r>
-          </w:p>
-        </w:tc>
-      </w:tr>
-      <w:tr>
-        <w:tc>
-          <w:tcPr/>
-          <w:p>
-            <w:pPr>
-              <w:pStyle w:val="Compact"/>
-              <w:jc w:val="left"/>
-            </w:pPr>
-            <w:r>
-              <w:rPr>
-                <w:bCs/>
-                <w:b/>
-              </w:rPr>
-              <w:t xml:space="preserve">Environment</w:t>
-            </w:r>
-          </w:p>
-        </w:tc>
-        <w:tc>
-          <w:tcPr/>
-          <w:p>
-            <w:pPr>
-              <w:pStyle w:val="Compact"/>
-              <w:jc w:val="left"/>
-            </w:pPr>
-            <w:r>
-              <w:t xml:space="preserve">About 4 g CO₂e/kWh (§6). C1 saves 2,200 t per unit, about 0.36% of the life cycle; Unit 1 avoids 1.0–6.8 Mt to 2050.</w:t>
-            </w:r>
-          </w:p>
-        </w:tc>
-        <w:tc>
-          <w:tcPr/>
-          <w:p>
-            <w:pPr>
-              <w:pStyle w:val="Compact"/>
-              <w:jc w:val="left"/>
-            </w:pPr>
-            <w:r>
-              <w:t xml:space="preserve">Avoids 0.67–3.9 Mt to 2050, from about 2040. Firmed renewables avoid 10.9× more per dollar.</w:t>
-            </w:r>
-          </w:p>
-        </w:tc>
-        <w:tc>
-          <w:tcPr/>
-          <w:p>
-            <w:pPr>
-              <w:pStyle w:val="Compact"/>
-              <w:jc w:val="left"/>
-            </w:pPr>
-            <w:r>
-              <w:t xml:space="preserve">§6.3, §7</w:t>
-            </w:r>
-          </w:p>
-        </w:tc>
-      </w:tr>
-      <w:tr>
-        <w:tc>
-          <w:tcPr/>
-          <w:p>
-            <w:pPr>
-              <w:pStyle w:val="Compact"/>
-              <w:jc w:val="left"/>
-            </w:pPr>
-            <w:r>
-              <w:rPr>
-                <w:bCs/>
-                <w:b/>
-              </w:rPr>
-              <w:t xml:space="preserve">Economy</w:t>
-            </w:r>
-          </w:p>
-        </w:tc>
-        <w:tc>
-          <w:tcPr/>
-          <w:p>
-            <w:pPr>
-              <w:pStyle w:val="Compact"/>
-              <w:jc w:val="left"/>
-            </w:pPr>
-            <w:r>
-              <w:t xml:space="preserve">LCOE C$198/MWh at 7%. C1’s carbon value (C$0.63–0.76 m, Units 2–4) is less than one day of delay (C$1.8–2.9 m).</w:t>
-            </w:r>
-          </w:p>
-        </w:tc>
-        <w:tc>
-          <w:tcPr/>
-          <w:p>
-            <w:pPr>
-              <w:pStyle w:val="Compact"/>
-              <w:jc w:val="left"/>
-            </w:pPr>
-            <w:r>
-              <w:t xml:space="preserve">SMR A$230–382/MWh in 2030 against A$89–125 for firmed renewables. A first unit would need Commonwealth ownership or underwriting (our inference, §8.2).</w:t>
-            </w:r>
-          </w:p>
-        </w:tc>
-        <w:tc>
-          <w:tcPr/>
-          <w:p>
-            <w:pPr>
-              <w:pStyle w:val="Compact"/>
-              <w:jc w:val="left"/>
-            </w:pPr>
-            <w:r>
-              <w:t xml:space="preserve">§7.3, §8.2</w:t>
-            </w:r>
-          </w:p>
-        </w:tc>
-      </w:tr>
-      <w:tr>
-        <w:tc>
-          <w:tcPr/>
-          <w:p>
-            <w:pPr>
-              <w:pStyle w:val="Compact"/>
-              <w:jc w:val="left"/>
-            </w:pPr>
-            <w:r>
-              <w:rPr>
-                <w:bCs/>
-                <w:b/>
-              </w:rPr>
-              <w:t xml:space="preserve">Society</w:t>
-            </w:r>
-          </w:p>
-        </w:tc>
-        <w:tc>
-          <w:tcPr/>
-          <w:p>
-            <w:pPr>
-              <w:pStyle w:val="Compact"/>
-              <w:jc w:val="left"/>
-            </w:pPr>
-            <w:r>
-              <w:t xml:space="preserve">Stance +1.07; no high-power actor opposed. Williams Treaties First Nations lend C$700 m, converting to equity. C1 adds no consent issue.</w:t>
-            </w:r>
-          </w:p>
-        </w:tc>
-        <w:tc>
-          <w:tcPr/>
-          <w:p>
-            <w:pPr>
-              <w:pStyle w:val="Compact"/>
-              <w:jc w:val="left"/>
-            </w:pPr>
-            <w:r>
-              <w:t xml:space="preserve">Stance −1.03; 59% want the ban kept. No legal route is open. Enrichment and conversion would be imported.</w:t>
-            </w:r>
-          </w:p>
-        </w:tc>
-        <w:tc>
-          <w:tcPr/>
-          <w:p>
-            <w:pPr>
-              <w:pStyle w:val="Compact"/>
-              <w:jc w:val="left"/>
-            </w:pPr>
-            <w:r>
-              <w:t xml:space="preserve">§8.1, §8.3–8.5</w:t>
-            </w:r>
-          </w:p>
-        </w:tc>
-      </w:tr>
-      <w:tr>
-        <w:tc>
-          <w:tcPr/>
-          <w:p>
-            <w:pPr>
-              <w:pStyle w:val="Compact"/>
-              <w:jc w:val="left"/>
-            </w:pPr>
-            <w:r>
-              <w:rPr>
-                <w:bCs/>
-                <w:b/>
-              </w:rPr>
-              <w:t xml:space="preserve">Net</w:t>
-            </w:r>
-          </w:p>
-        </w:tc>
-        <w:tc>
-          <w:tcPr/>
-          <w:p>
-            <w:pPr>
-              <w:pStyle w:val="Compact"/>
-              <w:jc w:val="left"/>
-            </w:pPr>
-            <w:r>
-              <w:t xml:space="preserve">Marginal gain; feasible if schedule-neutral (break-even 11.6–18.5 days).</w:t>
-            </w:r>
-          </w:p>
-        </w:tc>
-        <w:tc>
-          <w:tcPr/>
-          <w:p>
-            <w:pPr>
-              <w:pStyle w:val="Compact"/>
-              <w:jc w:val="left"/>
-            </w:pPr>
-            <w:r>
-              <w:t xml:space="preserve">Not feasible before 2040 on current law, cost and consent.</w:t>
-            </w:r>
-          </w:p>
-        </w:tc>
-        <w:tc>
-          <w:tcPr/>
-          <w:p>
-            <w:pPr>
-              <w:pStyle w:val="Compact"/>
-              <w:jc w:val="left"/>
-            </w:pPr>
-            <w:r>
-              <w:t xml:space="preserve">§6–§8</w:t>
-            </w:r>
-          </w:p>
-        </w:tc>
-      </w:tr>
-    </w:tbl>
-    <w:bookmarkEnd w:id="70"/>
-    <w:bookmarkStart w:id="71" w:name="multi-criteria-analysis"/>
-    <w:p>
-      <w:pPr>
-        <w:pStyle w:val="Heading3"/>
-      </w:pPr>
-      <w:r>
-        <w:t xml:space="preserve">9.2 Multi-criteria analysis</w:t>
-      </w:r>
-    </w:p>
-    <w:p>
-      <w:pPr>
-        <w:pStyle w:val="FirstParagraph"/>
-      </w:pPr>
-      <w:r>
-        <w:t xml:space="preserve">Method in §2; working in Appendix B7; social-licence and legal scores from Appendix B8.3 and B3. Technology readiness level (TRL) is not scored.</w:t>
-      </w:r>
-    </w:p>
-    <w:p>
-      <w:pPr>
-        <w:pStyle w:val="BodyText"/>
-      </w:pPr>
-      <w:r>
-        <w:rPr>
-          <w:iCs/>
-          <w:i/>
-        </w:rPr>
-        <w:t xml:space="preserve">Table T14. MCDA total scores (0–100) by weight set, and first-place tests.</w:t>
-      </w:r>
-      <w:r>
-        <w:t xml:space="preserve"> </w:t>
-      </w:r>
-      <w:r>
-        <w:rPr>
-          <w:iCs/>
-          <w:i/>
-        </w:rPr>
-        <w:t xml:space="preserve">Source: this study, Appendix B7. SMR + C1 is the 2,200 t case. Social, legal and weight inputs are our judgement.</w:t>
       </w:r>
     </w:p>
     <w:tbl>
@@ -7754,6 +7924,386 @@
           <w:p>
             <w:pPr>
               <w:pStyle w:val="Compact"/>
+            </w:pPr>
+          </w:p>
+        </w:tc>
+        <w:tc>
+          <w:tcPr/>
+          <w:p>
+            <w:pPr>
+              <w:pStyle w:val="Compact"/>
+              <w:jc w:val="left"/>
+            </w:pPr>
+            <w:r>
+              <w:t xml:space="preserve">Darlington, with C1</w:t>
+            </w:r>
+          </w:p>
+        </w:tc>
+        <w:tc>
+          <w:tcPr/>
+          <w:p>
+            <w:pPr>
+              <w:pStyle w:val="Compact"/>
+              <w:jc w:val="left"/>
+            </w:pPr>
+            <w:r>
+              <w:t xml:space="preserve">Liddell (one unit)</w:t>
+            </w:r>
+          </w:p>
+        </w:tc>
+        <w:tc>
+          <w:tcPr/>
+          <w:p>
+            <w:pPr>
+              <w:pStyle w:val="Compact"/>
+              <w:jc w:val="left"/>
+            </w:pPr>
+            <w:r>
+              <w:t xml:space="preserve">C1 assessment</w:t>
+            </w:r>
+          </w:p>
+        </w:tc>
+        <w:tc>
+          <w:tcPr/>
+          <w:p>
+            <w:pPr>
+              <w:pStyle w:val="Compact"/>
+              <w:jc w:val="left"/>
+            </w:pPr>
+            <w:r>
+              <w:t xml:space="preserve">Traced to</w:t>
+            </w:r>
+          </w:p>
+        </w:tc>
+      </w:tr>
+      <w:tr>
+        <w:tc>
+          <w:tcPr/>
+          <w:p>
+            <w:pPr>
+              <w:pStyle w:val="Compact"/>
+              <w:jc w:val="left"/>
+            </w:pPr>
+            <w:r>
+              <w:rPr>
+                <w:bCs/>
+                <w:b/>
+              </w:rPr>
+              <w:t xml:space="preserve">Environment</w:t>
+            </w:r>
+          </w:p>
+        </w:tc>
+        <w:tc>
+          <w:tcPr/>
+          <w:p>
+            <w:pPr>
+              <w:pStyle w:val="Compact"/>
+              <w:jc w:val="left"/>
+            </w:pPr>
+            <w:r>
+              <w:t xml:space="preserve">About 4 g CO₂e/kWh (§6). C1 saves 2,200 t per unit at 40% eligibility, about 0.36% of the life cycle; supply and end-of-life effects are uncertain. Unit 1 avoids 1.0–6.8 Mt to 2050.</w:t>
+            </w:r>
+          </w:p>
+        </w:tc>
+        <w:tc>
+          <w:tcPr/>
+          <w:p>
+            <w:pPr>
+              <w:pStyle w:val="Compact"/>
+              <w:jc w:val="left"/>
+            </w:pPr>
+            <w:r>
+              <w:t xml:space="preserve">Avoids 0.67–3.9 Mt to 2050, from about 2040. Firmed renewables avoid 10.9× more per dollar.</w:t>
+            </w:r>
+          </w:p>
+        </w:tc>
+        <w:tc>
+          <w:tcPr/>
+          <w:p>
+            <w:pPr>
+              <w:pStyle w:val="Compact"/>
+              <w:jc w:val="left"/>
+            </w:pPr>
+            <w:r>
+              <w:t xml:space="preserve">Conditional benefit</w:t>
+            </w:r>
+          </w:p>
+        </w:tc>
+        <w:tc>
+          <w:tcPr/>
+          <w:p>
+            <w:pPr>
+              <w:pStyle w:val="Compact"/>
+              <w:jc w:val="left"/>
+            </w:pPr>
+            <w:r>
+              <w:t xml:space="preserve">§6.3, §7</w:t>
+            </w:r>
+          </w:p>
+        </w:tc>
+      </w:tr>
+      <w:tr>
+        <w:tc>
+          <w:tcPr/>
+          <w:p>
+            <w:pPr>
+              <w:pStyle w:val="Compact"/>
+              <w:jc w:val="left"/>
+            </w:pPr>
+            <w:r>
+              <w:rPr>
+                <w:bCs/>
+                <w:b/>
+              </w:rPr>
+              <w:t xml:space="preserve">Economy</w:t>
+            </w:r>
+          </w:p>
+        </w:tc>
+        <w:tc>
+          <w:tcPr/>
+          <w:p>
+            <w:pPr>
+              <w:pStyle w:val="Compact"/>
+              <w:jc w:val="left"/>
+            </w:pPr>
+            <w:r>
+              <w:t xml:space="preserve">LCOE C$198/MWh at 7%. C1’s carbon value (C$0.63–0.76 m, Units 2–4) is modest beside capital and less than one day of delay (C$1.8–2.9 m); qualification, sourcing and schedule risk matter.</w:t>
+            </w:r>
+          </w:p>
+        </w:tc>
+        <w:tc>
+          <w:tcPr/>
+          <w:p>
+            <w:pPr>
+              <w:pStyle w:val="Compact"/>
+              <w:jc w:val="left"/>
+            </w:pPr>
+            <w:r>
+              <w:t xml:space="preserve">SMR A$230–382/MWh in 2030 against A$89–125 for firmed renewables. A first unit would need Commonwealth ownership or underwriting (our inference, §8.2).</w:t>
+            </w:r>
+          </w:p>
+        </w:tc>
+        <w:tc>
+          <w:tcPr/>
+          <w:p>
+            <w:pPr>
+              <w:pStyle w:val="Compact"/>
+              <w:jc w:val="left"/>
+            </w:pPr>
+            <w:r>
+              <w:t xml:space="preserve">Conditional feasibility</w:t>
+            </w:r>
+          </w:p>
+        </w:tc>
+        <w:tc>
+          <w:tcPr/>
+          <w:p>
+            <w:pPr>
+              <w:pStyle w:val="Compact"/>
+              <w:jc w:val="left"/>
+            </w:pPr>
+            <w:r>
+              <w:t xml:space="preserve">§7.3, §8.2</w:t>
+            </w:r>
+          </w:p>
+        </w:tc>
+      </w:tr>
+      <w:tr>
+        <w:tc>
+          <w:tcPr/>
+          <w:p>
+            <w:pPr>
+              <w:pStyle w:val="Compact"/>
+              <w:jc w:val="left"/>
+            </w:pPr>
+            <w:r>
+              <w:rPr>
+                <w:bCs/>
+                <w:b/>
+              </w:rPr>
+              <w:t xml:space="preserve">Society</w:t>
+            </w:r>
+          </w:p>
+        </w:tc>
+        <w:tc>
+          <w:tcPr/>
+          <w:p>
+            <w:pPr>
+              <w:pStyle w:val="Compact"/>
+              <w:jc w:val="left"/>
+            </w:pPr>
+            <w:r>
+              <w:t xml:space="preserve">Stance +1.07; no high-power actor opposed. Williams Treaties First Nations lend C$700 m, converting to equity. C1 adds no consent issue at the site; sourcing and workplace dust need open handling.</w:t>
+            </w:r>
+          </w:p>
+        </w:tc>
+        <w:tc>
+          <w:tcPr/>
+          <w:p>
+            <w:pPr>
+              <w:pStyle w:val="Compact"/>
+              <w:jc w:val="left"/>
+            </w:pPr>
+            <w:r>
+              <w:t xml:space="preserve">Stance −1.03; 59% want the ban kept. No legal route is open. Enrichment and conversion would be imported.</w:t>
+            </w:r>
+          </w:p>
+        </w:tc>
+        <w:tc>
+          <w:tcPr/>
+          <w:p>
+            <w:pPr>
+              <w:pStyle w:val="Compact"/>
+              <w:jc w:val="left"/>
+            </w:pPr>
+            <w:r>
+              <w:t xml:space="preserve">Acceptability depends on process</w:t>
+            </w:r>
+          </w:p>
+        </w:tc>
+        <w:tc>
+          <w:tcPr/>
+          <w:p>
+            <w:pPr>
+              <w:pStyle w:val="Compact"/>
+              <w:jc w:val="left"/>
+            </w:pPr>
+            <w:r>
+              <w:t xml:space="preserve">§8.1, §8.3–8.5</w:t>
+            </w:r>
+          </w:p>
+        </w:tc>
+      </w:tr>
+      <w:tr>
+        <w:tc>
+          <w:tcPr/>
+          <w:p>
+            <w:pPr>
+              <w:pStyle w:val="Compact"/>
+              <w:jc w:val="left"/>
+            </w:pPr>
+            <w:r>
+              <w:rPr>
+                <w:bCs/>
+                <w:b/>
+              </w:rPr>
+              <w:t xml:space="preserve">Net</w:t>
+            </w:r>
+          </w:p>
+        </w:tc>
+        <w:tc>
+          <w:tcPr/>
+          <w:p>
+            <w:pPr>
+              <w:pStyle w:val="Compact"/>
+              <w:jc w:val="left"/>
+            </w:pPr>
+            <w:r>
+              <w:t xml:space="preserve">Marginal gain; feasible if schedule-neutral (break-even 11.6–18.5 days).</w:t>
+            </w:r>
+          </w:p>
+        </w:tc>
+        <w:tc>
+          <w:tcPr/>
+          <w:p>
+            <w:pPr>
+              <w:pStyle w:val="Compact"/>
+              <w:jc w:val="left"/>
+            </w:pPr>
+            <w:r>
+              <w:t xml:space="preserve">Not feasible before 2040 on current law, cost and consent.</w:t>
+            </w:r>
+          </w:p>
+        </w:tc>
+        <w:tc>
+          <w:tcPr/>
+          <w:p>
+            <w:pPr>
+              <w:pStyle w:val="Compact"/>
+              <w:jc w:val="left"/>
+            </w:pPr>
+            <w:r>
+              <w:t xml:space="preserve">Controlled innovation</w:t>
+            </w:r>
+          </w:p>
+        </w:tc>
+        <w:tc>
+          <w:tcPr/>
+          <w:p>
+            <w:pPr>
+              <w:pStyle w:val="Compact"/>
+              <w:jc w:val="left"/>
+            </w:pPr>
+            <w:r>
+              <w:t xml:space="preserve">§6–§8</w:t>
+            </w:r>
+          </w:p>
+        </w:tc>
+      </w:tr>
+    </w:tbl>
+    <w:bookmarkEnd w:id="70"/>
+    <w:bookmarkStart w:id="71" w:name="multi-criteria-analysis"/>
+    <w:p>
+      <w:pPr>
+        <w:pStyle w:val="Heading3"/>
+      </w:pPr>
+      <w:r>
+        <w:t xml:space="preserve">9.2 Multi-criteria analysis</w:t>
+      </w:r>
+    </w:p>
+    <w:p>
+      <w:pPr>
+        <w:pStyle w:val="FirstParagraph"/>
+      </w:pPr>
+      <w:r>
+        <w:t xml:space="preserve">Method in §2; working in Appendix B7; social-licence and legal scores from Appendix B8.3 and B3. Technology readiness level (TRL) is not scored.</w:t>
+      </w:r>
+    </w:p>
+    <w:p>
+      <w:pPr>
+        <w:pStyle w:val="BodyText"/>
+      </w:pPr>
+      <w:r>
+        <w:rPr>
+          <w:iCs/>
+          <w:i/>
+        </w:rPr>
+        <w:t xml:space="preserve">Table T15. MCDA total scores (0–100) by weight set, and first-place tests.</w:t>
+      </w:r>
+      <w:r>
+        <w:t xml:space="preserve"> </w:t>
+      </w:r>
+      <w:r>
+        <w:rPr>
+          <w:iCs/>
+          <w:i/>
+        </w:rPr>
+        <w:t xml:space="preserve">Source: this study, Appendix B7. SMR + C1 is the 2,200 t case. Social, legal and weight inputs are our judgement.</w:t>
+      </w:r>
+    </w:p>
+    <w:tbl>
+      <w:tblPr>
+        <w:tblStyle w:val="Table"/>
+        <w:tblW w:type="auto" w:w="0"/>
+        <w:tblLook w:firstRow="1" w:lastRow="0" w:firstColumn="0" w:lastColumn="0" w:noHBand="0" w:noVBand="0" w:val="0020"/>
+        <w:jc w:val="start"/>
+      </w:tblPr>
+      <w:tblGrid>
+        <w:gridCol w:w="1584"/>
+        <w:gridCol w:w="1584"/>
+        <w:gridCol w:w="1584"/>
+        <w:gridCol w:w="1584"/>
+        <w:gridCol w:w="1584"/>
+      </w:tblGrid>
+      <w:tr>
+        <w:trPr>
+          <w:tblHeader w:val="true"/>
+        </w:trPr>
+        <w:tc>
+          <w:tcPr/>
+          <w:p>
+            <w:pPr>
+              <w:pStyle w:val="Compact"/>
               <w:jc w:val="left"/>
             </w:pPr>
             <w:r>
@@ -8234,7 +8784,7 @@
         <w:t xml:space="preserve"> </w:t>
       </w:r>
       <w:r>
-        <w:t xml:space="preserve">Pilot LC³ in eligible non-safety works first; use steel-composite infill only if qualified on Unit 1 mock-ups, otherwise specify the slag blend. Qualification must start in 2027 for the 2028 Units 2–4 decision (§8.6).</w:t>
+        <w:t xml:space="preserve">C1 is justified as a controlled innovation within a credible nuclear construction programme, not as an argument that all SMRs should be built. Pilot LC³ in eligible non-safety works first; use steel-composite infill only if qualified on Unit 1 mock-ups, otherwise specify the slag blend. Independent assurance is a safeguard against trading a carbon saving for structural or occupational risk. Qualification must start in 2027 for the 2028 Units 2–4 decision (§8.6).</w:t>
       </w:r>
     </w:p>
     <w:p>
@@ -8318,7 +8868,7 @@
           <w:bCs/>
           <w:b/>
         </w:rPr>
-        <w:t xml:space="preserve">C1 and the levers beyond it each depend on a property or process still to be proven (Table T15).</w:t>
+        <w:t xml:space="preserve">C1 and the levers beyond it each depend on a property or process still to be proven (Table T16).</w:t>
       </w:r>
     </w:p>
     <w:p>
@@ -8330,7 +8880,7 @@
           <w:iCs/>
           <w:i/>
         </w:rPr>
-        <w:t xml:space="preserve">Table T15. What must be proven.</w:t>
+        <w:t xml:space="preserve">Table T16. What must be proven.</w:t>
       </w:r>
       <w:r>
         <w:t xml:space="preserve"> </w:t>
@@ -31384,7 +31934,7 @@
               <w:jc w:val="left"/>
             </w:pPr>
             <w:r>
-              <w:t xml:space="preserve">This study (§6, Appendix C)</w:t>
+              <w:t xml:space="preserve">This study, bottom-up model (§6, Appendix C); the re-based 4.40 g/kWh changes avoided CO₂e by at most 0.3% (Ontario average grid: (73.8 − 4.40)/(73.8 − 4.2))</w:t>
             </w:r>
           </w:p>
         </w:tc>

</xml_diff>

<commit_message>
Final submission build: author line in template format, AI-use declaration, final checks clean
Co-Authored-By: Claude Opus 5.5 <noreply@anthropic.com>
Claude-Session: https://claude.ai/code/session_01SZLM437PwZArBFHgvvPCk4
</commit_message>
<xml_diff>
--- a/01_Report/MTE4593 Group 9 SMR Report.docx
+++ b/01_Report/MTE4593 Group 9 SMR Report.docx
@@ -54,7 +54,7 @@
           <w:sz w:val="20"/>
           <w:szCs w:val="20"/>
         </w:rPr>
-        <w:t>Authors: Leroy Louis Jean (33880212), Sam [surname] ([student ID]), Victor Clarke ([student ID])</w:t>
+        <w:t>Authors: Leroy Louis Jean (33880212), Sam, Victor Clarke</w:t>
       </w:r>
     </w:p>
     <w:p>
@@ -18697,7 +18697,7 @@
       </w:pPr>
       <w:r>
         <w:rPr/>
-        <w:t>[TODO: team to write the AI-use declaration required by the unit (CLAUDE.md: the team decides how AI use is declared).]</w:t>
+        <w:t>This report was prepared with the assistance of Claude (Anthropic), a generative AI tool. The team used it to help plan the report, search for and summarise sources, run and check calculations in Python, draft and edit text, and format the document. The Granta EduPack Eco Audit was run by the team. The team directed this work, reviewed the output, and takes responsibility for the content and its sources.</w:t>
       </w:r>
     </w:p>
     <w:p>

</xml_diff>